<commit_message>
annexure company_seal and shiping no fix.
</commit_message>
<xml_diff>
--- a/templates/ANX C.docx
+++ b/templates/ANX C.docx
@@ -35,9 +35,9 @@
         <w:tblLook w:val="0400"/>
       </w:tblPr>
       <w:tblGrid>
-        <w:gridCol w:w="520"/>
+        <w:gridCol w:w="518"/>
         <w:gridCol w:w="4905"/>
-        <w:gridCol w:w="4436"/>
+        <w:gridCol w:w="4438"/>
       </w:tblGrid>
       <w:tr>
         <w:trPr>
@@ -60,20 +60,18 @@
               <w:pStyle w:val="normal1"/>
               <w:jc w:val="center"/>
               <w:rPr>
-                <w:rFonts w:ascii="Arial" w:hAnsi="Arial" w:eastAsia="Arial" w:cs="Arial"/>
+                <w:rFonts w:ascii="Arial" w:hAnsi="Arial"/>
+                <w:sz w:val="18"/>
+                <w:szCs w:val="18"/>
+              </w:rPr>
+            </w:pPr>
+            <w:r>
+              <w:rPr>
+                <w:rFonts w:eastAsia="Arial" w:cs="Arial" w:ascii="Arial" w:hAnsi="Arial"/>
                 <w:b/>
                 <w:bCs/>
-                <w:sz w:val="22"/>
-                <w:szCs w:val="22"/>
-              </w:rPr>
-            </w:pPr>
-            <w:r>
-              <w:rPr>
-                <w:rFonts w:eastAsia="Arial" w:cs="Arial" w:ascii="Arial" w:hAnsi="Arial"/>
-                <w:b/>
-                <w:bCs/>
-                <w:sz w:val="22"/>
-                <w:szCs w:val="22"/>
+                <w:sz w:val="18"/>
+                <w:szCs w:val="18"/>
               </w:rPr>
               <w:t>ANNEXURE C</w:t>
             </w:r>
@@ -105,20 +103,18 @@
               </w:tabs>
               <w:jc w:val="center"/>
               <w:rPr>
-                <w:rFonts w:ascii="Arial" w:hAnsi="Arial" w:eastAsia="Arial" w:cs="Arial"/>
+                <w:rFonts w:ascii="Arial" w:hAnsi="Arial"/>
+                <w:sz w:val="18"/>
+                <w:szCs w:val="18"/>
+              </w:rPr>
+            </w:pPr>
+            <w:r>
+              <w:rPr>
+                <w:rFonts w:eastAsia="Arial" w:cs="Arial" w:ascii="Arial" w:hAnsi="Arial"/>
                 <w:b/>
                 <w:bCs/>
-                <w:sz w:val="22"/>
-                <w:szCs w:val="22"/>
-              </w:rPr>
-            </w:pPr>
-            <w:r>
-              <w:rPr>
-                <w:rFonts w:eastAsia="Arial" w:cs="Arial" w:ascii="Arial" w:hAnsi="Arial"/>
-                <w:b/>
-                <w:bCs/>
-                <w:sz w:val="22"/>
-                <w:szCs w:val="22"/>
+                <w:sz w:val="18"/>
+                <w:szCs w:val="18"/>
               </w:rPr>
               <w:t>EXPORT UNDER SELF SEALING SCHEME</w:t>
             </w:r>
@@ -144,7 +140,7 @@
             <w:pPr>
               <w:pStyle w:val="normal1"/>
               <w:rPr>
-                <w:rFonts w:ascii="Arial" w:hAnsi="Arial" w:eastAsia="Arial" w:cs="Arial"/>
+                <w:rFonts w:ascii="Arial" w:hAnsi="Arial"/>
                 <w:sz w:val="18"/>
                 <w:szCs w:val="18"/>
               </w:rPr>
@@ -205,7 +201,7 @@
             <w:pPr>
               <w:pStyle w:val="normal1"/>
               <w:rPr>
-                <w:rFonts w:ascii="Arial" w:hAnsi="Arial" w:eastAsia="Arial" w:cs="Arial"/>
+                <w:rFonts w:ascii="Arial" w:hAnsi="Arial"/>
                 <w:sz w:val="18"/>
                 <w:szCs w:val="18"/>
               </w:rPr>
@@ -240,7 +236,7 @@
             <w:pPr>
               <w:pStyle w:val="normal1"/>
               <w:rPr>
-                <w:rFonts w:ascii="Arial" w:hAnsi="Arial" w:eastAsia="Arial" w:cs="Arial"/>
+                <w:rFonts w:ascii="Arial" w:hAnsi="Arial"/>
                 <w:sz w:val="18"/>
                 <w:szCs w:val="18"/>
               </w:rPr>
@@ -262,7 +258,7 @@
         </w:trPr>
         <w:tc>
           <w:tcPr>
-            <w:tcW w:w="520" w:type="dxa"/>
+            <w:tcW w:w="518" w:type="dxa"/>
             <w:tcBorders>
               <w:left w:val="single" w:sz="4" w:space="0" w:color="000000"/>
               <w:bottom w:val="single" w:sz="4" w:space="0" w:color="000000"/>
@@ -275,7 +271,7 @@
               <w:pStyle w:val="normal1"/>
               <w:jc w:val="center"/>
               <w:rPr>
-                <w:rFonts w:ascii="Arial" w:hAnsi="Arial" w:eastAsia="Arial" w:cs="Arial"/>
+                <w:rFonts w:ascii="Arial" w:hAnsi="Arial"/>
                 <w:sz w:val="18"/>
                 <w:szCs w:val="18"/>
               </w:rPr>
@@ -303,7 +299,7 @@
             <w:pPr>
               <w:pStyle w:val="normal1"/>
               <w:rPr>
-                <w:rFonts w:ascii="Arial" w:hAnsi="Arial" w:eastAsia="Arial" w:cs="Arial"/>
+                <w:rFonts w:ascii="Arial" w:hAnsi="Arial"/>
                 <w:sz w:val="18"/>
                 <w:szCs w:val="18"/>
               </w:rPr>
@@ -320,18 +316,18 @@
         </w:tc>
         <w:tc>
           <w:tcPr>
-            <w:tcW w:w="4436" w:type="dxa"/>
-            <w:tcBorders>
-              <w:bottom w:val="single" w:sz="4" w:space="0" w:color="000000"/>
-              <w:right w:val="single" w:sz="4" w:space="0" w:color="000000"/>
-            </w:tcBorders>
-            <w:vAlign w:val="center"/>
-          </w:tcPr>
-          <w:p>
-            <w:pPr>
-              <w:pStyle w:val="normal1"/>
-              <w:rPr>
-                <w:rFonts w:ascii="Arial" w:hAnsi="Arial" w:eastAsia="Arial" w:cs="Arial"/>
+            <w:tcW w:w="4438" w:type="dxa"/>
+            <w:tcBorders>
+              <w:bottom w:val="single" w:sz="4" w:space="0" w:color="000000"/>
+              <w:right w:val="single" w:sz="4" w:space="0" w:color="000000"/>
+            </w:tcBorders>
+            <w:vAlign w:val="center"/>
+          </w:tcPr>
+          <w:p>
+            <w:pPr>
+              <w:pStyle w:val="normal1"/>
+              <w:rPr>
+                <w:rFonts w:ascii="Arial" w:hAnsi="Arial"/>
                 <w:sz w:val="18"/>
                 <w:szCs w:val="18"/>
               </w:rPr>
@@ -353,7 +349,7 @@
         </w:trPr>
         <w:tc>
           <w:tcPr>
-            <w:tcW w:w="520" w:type="dxa"/>
+            <w:tcW w:w="518" w:type="dxa"/>
             <w:tcBorders>
               <w:left w:val="single" w:sz="4" w:space="0" w:color="000000"/>
               <w:bottom w:val="single" w:sz="4" w:space="0" w:color="000000"/>
@@ -366,7 +362,7 @@
               <w:pStyle w:val="normal1"/>
               <w:jc w:val="center"/>
               <w:rPr>
-                <w:rFonts w:ascii="Arial" w:hAnsi="Arial" w:eastAsia="Arial" w:cs="Arial"/>
+                <w:rFonts w:ascii="Arial" w:hAnsi="Arial"/>
                 <w:sz w:val="18"/>
                 <w:szCs w:val="18"/>
               </w:rPr>
@@ -394,7 +390,7 @@
             <w:pPr>
               <w:pStyle w:val="normal1"/>
               <w:rPr>
-                <w:rFonts w:ascii="Arial" w:hAnsi="Arial" w:eastAsia="Arial" w:cs="Arial"/>
+                <w:rFonts w:ascii="Arial" w:hAnsi="Arial"/>
                 <w:sz w:val="18"/>
                 <w:szCs w:val="18"/>
               </w:rPr>
@@ -411,18 +407,18 @@
         </w:tc>
         <w:tc>
           <w:tcPr>
-            <w:tcW w:w="4436" w:type="dxa"/>
-            <w:tcBorders>
-              <w:bottom w:val="single" w:sz="4" w:space="0" w:color="000000"/>
-              <w:right w:val="single" w:sz="4" w:space="0" w:color="000000"/>
-            </w:tcBorders>
-            <w:vAlign w:val="center"/>
-          </w:tcPr>
-          <w:p>
-            <w:pPr>
-              <w:pStyle w:val="normal1"/>
-              <w:rPr>
-                <w:rFonts w:ascii="Arial" w:hAnsi="Arial" w:eastAsia="Arial" w:cs="Arial"/>
+            <w:tcW w:w="4438" w:type="dxa"/>
+            <w:tcBorders>
+              <w:bottom w:val="single" w:sz="4" w:space="0" w:color="000000"/>
+              <w:right w:val="single" w:sz="4" w:space="0" w:color="000000"/>
+            </w:tcBorders>
+            <w:vAlign w:val="center"/>
+          </w:tcPr>
+          <w:p>
+            <w:pPr>
+              <w:pStyle w:val="normal1"/>
+              <w:rPr>
+                <w:rFonts w:ascii="Arial" w:hAnsi="Arial"/>
                 <w:sz w:val="18"/>
                 <w:szCs w:val="18"/>
               </w:rPr>
@@ -444,7 +440,7 @@
         </w:trPr>
         <w:tc>
           <w:tcPr>
-            <w:tcW w:w="520" w:type="dxa"/>
+            <w:tcW w:w="518" w:type="dxa"/>
             <w:tcBorders>
               <w:left w:val="single" w:sz="4" w:space="0" w:color="000000"/>
               <w:bottom w:val="single" w:sz="4" w:space="0" w:color="000000"/>
@@ -484,7 +480,7 @@
             <w:pPr>
               <w:pStyle w:val="normal1"/>
               <w:rPr>
-                <w:rFonts w:ascii="Arial" w:hAnsi="Arial" w:eastAsia="Arial" w:cs="Arial"/>
+                <w:rFonts w:ascii="Arial" w:hAnsi="Arial"/>
                 <w:sz w:val="18"/>
                 <w:szCs w:val="18"/>
               </w:rPr>
@@ -501,7 +497,7 @@
         </w:tc>
         <w:tc>
           <w:tcPr>
-            <w:tcW w:w="4436" w:type="dxa"/>
+            <w:tcW w:w="4438" w:type="dxa"/>
             <w:tcBorders>
               <w:bottom w:val="single" w:sz="4" w:space="0" w:color="000000"/>
               <w:right w:val="single" w:sz="4" w:space="0" w:color="000000"/>
@@ -533,7 +529,7 @@
         </w:trPr>
         <w:tc>
           <w:tcPr>
-            <w:tcW w:w="520" w:type="dxa"/>
+            <w:tcW w:w="518" w:type="dxa"/>
             <w:tcBorders>
               <w:left w:val="single" w:sz="4" w:space="0" w:color="000000"/>
               <w:bottom w:val="single" w:sz="4" w:space="0" w:color="000000"/>
@@ -573,7 +569,7 @@
             <w:pPr>
               <w:pStyle w:val="normal1"/>
               <w:rPr>
-                <w:rFonts w:ascii="Arial" w:hAnsi="Arial" w:eastAsia="Arial" w:cs="Arial"/>
+                <w:rFonts w:ascii="Arial" w:hAnsi="Arial"/>
                 <w:sz w:val="18"/>
                 <w:szCs w:val="18"/>
               </w:rPr>
@@ -590,7 +586,7 @@
         </w:tc>
         <w:tc>
           <w:tcPr>
-            <w:tcW w:w="4436" w:type="dxa"/>
+            <w:tcW w:w="4438" w:type="dxa"/>
             <w:tcBorders>
               <w:bottom w:val="single" w:sz="4" w:space="0" w:color="000000"/>
               <w:right w:val="single" w:sz="4" w:space="0" w:color="000000"/>
@@ -622,7 +618,7 @@
         </w:trPr>
         <w:tc>
           <w:tcPr>
-            <w:tcW w:w="520" w:type="dxa"/>
+            <w:tcW w:w="518" w:type="dxa"/>
             <w:tcBorders>
               <w:left w:val="single" w:sz="4" w:space="0" w:color="000000"/>
               <w:bottom w:val="single" w:sz="4" w:space="0" w:color="000000"/>
@@ -662,7 +658,7 @@
             <w:pPr>
               <w:pStyle w:val="normal1"/>
               <w:rPr>
-                <w:rFonts w:ascii="Arial" w:hAnsi="Arial" w:eastAsia="Arial" w:cs="Arial"/>
+                <w:rFonts w:ascii="Arial" w:hAnsi="Arial"/>
                 <w:sz w:val="18"/>
                 <w:szCs w:val="18"/>
               </w:rPr>
@@ -679,18 +675,18 @@
         </w:tc>
         <w:tc>
           <w:tcPr>
-            <w:tcW w:w="4436" w:type="dxa"/>
-            <w:tcBorders>
-              <w:bottom w:val="single" w:sz="4" w:space="0" w:color="000000"/>
-              <w:right w:val="single" w:sz="4" w:space="0" w:color="000000"/>
-            </w:tcBorders>
-            <w:vAlign w:val="center"/>
-          </w:tcPr>
-          <w:p>
-            <w:pPr>
-              <w:pStyle w:val="normal1"/>
-              <w:rPr>
-                <w:rFonts w:ascii="Arial" w:hAnsi="Arial" w:eastAsia="Arial" w:cs="Arial"/>
+            <w:tcW w:w="4438" w:type="dxa"/>
+            <w:tcBorders>
+              <w:bottom w:val="single" w:sz="4" w:space="0" w:color="000000"/>
+              <w:right w:val="single" w:sz="4" w:space="0" w:color="000000"/>
+            </w:tcBorders>
+            <w:vAlign w:val="center"/>
+          </w:tcPr>
+          <w:p>
+            <w:pPr>
+              <w:pStyle w:val="normal1"/>
+              <w:rPr>
+                <w:rFonts w:ascii="Arial" w:hAnsi="Arial"/>
                 <w:sz w:val="18"/>
                 <w:szCs w:val="18"/>
               </w:rPr>
@@ -712,7 +708,7 @@
         </w:trPr>
         <w:tc>
           <w:tcPr>
-            <w:tcW w:w="520" w:type="dxa"/>
+            <w:tcW w:w="518" w:type="dxa"/>
             <w:tcBorders>
               <w:left w:val="single" w:sz="4" w:space="0" w:color="000000"/>
               <w:bottom w:val="single" w:sz="4" w:space="0" w:color="000000"/>
@@ -725,7 +721,7 @@
               <w:pStyle w:val="normal1"/>
               <w:jc w:val="center"/>
               <w:rPr>
-                <w:rFonts w:ascii="Arial" w:hAnsi="Arial" w:eastAsia="Arial" w:cs="Arial"/>
+                <w:rFonts w:ascii="Arial" w:hAnsi="Arial"/>
                 <w:sz w:val="18"/>
                 <w:szCs w:val="18"/>
               </w:rPr>
@@ -753,7 +749,7 @@
             <w:pPr>
               <w:pStyle w:val="normal1"/>
               <w:rPr>
-                <w:rFonts w:ascii="Arial" w:hAnsi="Arial" w:eastAsia="Arial" w:cs="Arial"/>
+                <w:rFonts w:ascii="Arial" w:hAnsi="Arial"/>
                 <w:sz w:val="18"/>
                 <w:szCs w:val="18"/>
               </w:rPr>
@@ -770,7 +766,7 @@
         </w:tc>
         <w:tc>
           <w:tcPr>
-            <w:tcW w:w="4436" w:type="dxa"/>
+            <w:tcW w:w="4438" w:type="dxa"/>
             <w:tcBorders>
               <w:bottom w:val="single" w:sz="4" w:space="0" w:color="000000"/>
               <w:right w:val="single" w:sz="4" w:space="0" w:color="000000"/>
@@ -802,7 +798,7 @@
         </w:trPr>
         <w:tc>
           <w:tcPr>
-            <w:tcW w:w="520" w:type="dxa"/>
+            <w:tcW w:w="518" w:type="dxa"/>
             <w:tcBorders>
               <w:left w:val="single" w:sz="4" w:space="0" w:color="000000"/>
               <w:bottom w:val="single" w:sz="4" w:space="0" w:color="000000"/>
@@ -815,7 +811,7 @@
               <w:pStyle w:val="normal1"/>
               <w:jc w:val="center"/>
               <w:rPr>
-                <w:rFonts w:ascii="Arial" w:hAnsi="Arial" w:eastAsia="Arial" w:cs="Arial"/>
+                <w:rFonts w:ascii="Arial" w:hAnsi="Arial"/>
                 <w:sz w:val="18"/>
                 <w:szCs w:val="18"/>
               </w:rPr>
@@ -843,7 +839,7 @@
             <w:pPr>
               <w:pStyle w:val="normal1"/>
               <w:rPr>
-                <w:rFonts w:ascii="Arial" w:hAnsi="Arial" w:eastAsia="Arial" w:cs="Arial"/>
+                <w:rFonts w:ascii="Arial" w:hAnsi="Arial"/>
                 <w:sz w:val="18"/>
                 <w:szCs w:val="18"/>
               </w:rPr>
@@ -860,18 +856,18 @@
         </w:tc>
         <w:tc>
           <w:tcPr>
-            <w:tcW w:w="4436" w:type="dxa"/>
-            <w:tcBorders>
-              <w:bottom w:val="single" w:sz="4" w:space="0" w:color="000000"/>
-              <w:right w:val="single" w:sz="4" w:space="0" w:color="000000"/>
-            </w:tcBorders>
-            <w:vAlign w:val="center"/>
-          </w:tcPr>
-          <w:p>
-            <w:pPr>
-              <w:pStyle w:val="normal1"/>
-              <w:rPr>
-                <w:rFonts w:ascii="Arial" w:hAnsi="Arial" w:eastAsia="Arial" w:cs="Arial"/>
+            <w:tcW w:w="4438" w:type="dxa"/>
+            <w:tcBorders>
+              <w:bottom w:val="single" w:sz="4" w:space="0" w:color="000000"/>
+              <w:right w:val="single" w:sz="4" w:space="0" w:color="000000"/>
+            </w:tcBorders>
+            <w:vAlign w:val="center"/>
+          </w:tcPr>
+          <w:p>
+            <w:pPr>
+              <w:pStyle w:val="normal1"/>
+              <w:rPr>
+                <w:rFonts w:ascii="Arial" w:hAnsi="Arial"/>
                 <w:sz w:val="18"/>
                 <w:szCs w:val="18"/>
               </w:rPr>
@@ -889,14 +885,14 @@
             <w:pPr>
               <w:pStyle w:val="normal1"/>
               <w:rPr>
-                <w:rFonts w:ascii="Arial" w:hAnsi="Arial" w:eastAsia="Arial" w:cs="Arial"/>
-                <w:sz w:val="18"/>
-                <w:szCs w:val="18"/>
-              </w:rPr>
-            </w:pPr>
-            <w:r>
-              <w:rPr>
-                <w:rFonts w:eastAsia="Arial" w:cs="Arial" w:ascii="Arial" w:hAnsi="Arial"/>
+                <w:rFonts w:ascii="Arial" w:hAnsi="Arial"/>
+                <w:sz w:val="18"/>
+                <w:szCs w:val="18"/>
+              </w:rPr>
+            </w:pPr>
+            <w:r>
+              <w:rPr>
+                <w:rFonts w:ascii="Arial" w:hAnsi="Arial"/>
                 <w:sz w:val="18"/>
                 <w:szCs w:val="18"/>
               </w:rPr>
@@ -911,7 +907,7 @@
         </w:trPr>
         <w:tc>
           <w:tcPr>
-            <w:tcW w:w="520" w:type="dxa"/>
+            <w:tcW w:w="518" w:type="dxa"/>
             <w:tcBorders>
               <w:left w:val="single" w:sz="4" w:space="0" w:color="000000"/>
               <w:bottom w:val="single" w:sz="4" w:space="0" w:color="000000"/>
@@ -924,7 +920,7 @@
               <w:pStyle w:val="normal1"/>
               <w:jc w:val="center"/>
               <w:rPr>
-                <w:rFonts w:ascii="Arial" w:hAnsi="Arial" w:eastAsia="Arial" w:cs="Arial"/>
+                <w:rFonts w:ascii="Arial" w:hAnsi="Arial"/>
                 <w:sz w:val="18"/>
                 <w:szCs w:val="18"/>
               </w:rPr>
@@ -952,7 +948,7 @@
             <w:pPr>
               <w:pStyle w:val="normal1"/>
               <w:rPr>
-                <w:rFonts w:ascii="Arial" w:hAnsi="Arial" w:eastAsia="Arial" w:cs="Arial"/>
+                <w:rFonts w:ascii="Arial" w:hAnsi="Arial"/>
                 <w:sz w:val="18"/>
                 <w:szCs w:val="18"/>
               </w:rPr>
@@ -969,7 +965,7 @@
         </w:tc>
         <w:tc>
           <w:tcPr>
-            <w:tcW w:w="4436" w:type="dxa"/>
+            <w:tcW w:w="4438" w:type="dxa"/>
             <w:tcBorders>
               <w:bottom w:val="single" w:sz="4" w:space="0" w:color="000000"/>
               <w:right w:val="single" w:sz="4" w:space="0" w:color="000000"/>
@@ -1001,7 +997,7 @@
         </w:trPr>
         <w:tc>
           <w:tcPr>
-            <w:tcW w:w="520" w:type="dxa"/>
+            <w:tcW w:w="518" w:type="dxa"/>
             <w:tcBorders>
               <w:left w:val="single" w:sz="4" w:space="0" w:color="000000"/>
               <w:bottom w:val="single" w:sz="4" w:space="0" w:color="000000"/>
@@ -1014,7 +1010,7 @@
               <w:pStyle w:val="normal1"/>
               <w:jc w:val="center"/>
               <w:rPr>
-                <w:rFonts w:ascii="Arial" w:hAnsi="Arial" w:eastAsia="Arial" w:cs="Arial"/>
+                <w:rFonts w:ascii="Arial" w:hAnsi="Arial"/>
                 <w:sz w:val="18"/>
                 <w:szCs w:val="18"/>
               </w:rPr>
@@ -1042,7 +1038,7 @@
             <w:pPr>
               <w:pStyle w:val="normal1"/>
               <w:rPr>
-                <w:rFonts w:ascii="Arial" w:hAnsi="Arial" w:eastAsia="Arial" w:cs="Arial"/>
+                <w:rFonts w:ascii="Arial" w:hAnsi="Arial"/>
                 <w:sz w:val="18"/>
                 <w:szCs w:val="18"/>
               </w:rPr>
@@ -1059,7 +1055,7 @@
         </w:tc>
         <w:tc>
           <w:tcPr>
-            <w:tcW w:w="4436" w:type="dxa"/>
+            <w:tcW w:w="4438" w:type="dxa"/>
             <w:tcBorders>
               <w:bottom w:val="single" w:sz="4" w:space="0" w:color="000000"/>
               <w:right w:val="single" w:sz="4" w:space="0" w:color="000000"/>
@@ -1091,7 +1087,7 @@
         </w:trPr>
         <w:tc>
           <w:tcPr>
-            <w:tcW w:w="520" w:type="dxa"/>
+            <w:tcW w:w="518" w:type="dxa"/>
             <w:tcBorders>
               <w:left w:val="single" w:sz="4" w:space="0" w:color="000000"/>
               <w:bottom w:val="single" w:sz="4" w:space="0" w:color="000000"/>
@@ -1104,7 +1100,7 @@
               <w:pStyle w:val="normal1"/>
               <w:jc w:val="center"/>
               <w:rPr>
-                <w:rFonts w:ascii="Arial" w:hAnsi="Arial" w:eastAsia="Arial" w:cs="Arial"/>
+                <w:rFonts w:ascii="Arial" w:hAnsi="Arial"/>
                 <w:sz w:val="18"/>
                 <w:szCs w:val="18"/>
               </w:rPr>
@@ -1132,7 +1128,7 @@
             <w:pPr>
               <w:pStyle w:val="normal1"/>
               <w:rPr>
-                <w:rFonts w:ascii="Arial" w:hAnsi="Arial" w:eastAsia="Arial" w:cs="Arial"/>
+                <w:rFonts w:ascii="Arial" w:hAnsi="Arial"/>
                 <w:sz w:val="18"/>
                 <w:szCs w:val="18"/>
               </w:rPr>
@@ -1149,18 +1145,18 @@
         </w:tc>
         <w:tc>
           <w:tcPr>
-            <w:tcW w:w="4436" w:type="dxa"/>
-            <w:tcBorders>
-              <w:bottom w:val="single" w:sz="4" w:space="0" w:color="000000"/>
-              <w:right w:val="single" w:sz="4" w:space="0" w:color="000000"/>
-            </w:tcBorders>
-            <w:vAlign w:val="center"/>
-          </w:tcPr>
-          <w:p>
-            <w:pPr>
-              <w:pStyle w:val="normal1"/>
-              <w:rPr>
-                <w:rFonts w:ascii="Arial" w:hAnsi="Arial" w:eastAsia="Arial" w:cs="Arial"/>
+            <w:tcW w:w="4438" w:type="dxa"/>
+            <w:tcBorders>
+              <w:bottom w:val="single" w:sz="4" w:space="0" w:color="000000"/>
+              <w:right w:val="single" w:sz="4" w:space="0" w:color="000000"/>
+            </w:tcBorders>
+            <w:vAlign w:val="center"/>
+          </w:tcPr>
+          <w:p>
+            <w:pPr>
+              <w:pStyle w:val="normal1"/>
+              <w:rPr>
+                <w:rFonts w:ascii="Arial" w:hAnsi="Arial"/>
                 <w:sz w:val="18"/>
                 <w:szCs w:val="18"/>
               </w:rPr>
@@ -1182,7 +1178,7 @@
         </w:trPr>
         <w:tc>
           <w:tcPr>
-            <w:tcW w:w="520" w:type="dxa"/>
+            <w:tcW w:w="518" w:type="dxa"/>
             <w:tcBorders>
               <w:left w:val="single" w:sz="4" w:space="0" w:color="000000"/>
               <w:bottom w:val="single" w:sz="4" w:space="0" w:color="000000"/>
@@ -1195,7 +1191,7 @@
               <w:pStyle w:val="normal1"/>
               <w:jc w:val="center"/>
               <w:rPr>
-                <w:rFonts w:ascii="Arial" w:hAnsi="Arial" w:eastAsia="Arial" w:cs="Arial"/>
+                <w:rFonts w:ascii="Arial" w:hAnsi="Arial"/>
                 <w:sz w:val="18"/>
                 <w:szCs w:val="18"/>
               </w:rPr>
@@ -1223,7 +1219,7 @@
             <w:pPr>
               <w:pStyle w:val="normal1"/>
               <w:rPr>
-                <w:rFonts w:ascii="Arial" w:hAnsi="Arial" w:eastAsia="Arial" w:cs="Arial"/>
+                <w:rFonts w:ascii="Arial" w:hAnsi="Arial"/>
                 <w:sz w:val="18"/>
                 <w:szCs w:val="18"/>
               </w:rPr>
@@ -1240,7 +1236,7 @@
         </w:tc>
         <w:tc>
           <w:tcPr>
-            <w:tcW w:w="4436" w:type="dxa"/>
+            <w:tcW w:w="4438" w:type="dxa"/>
             <w:tcBorders>
               <w:left w:val="single" w:sz="4" w:space="0" w:color="000000"/>
               <w:bottom w:val="single" w:sz="4" w:space="0" w:color="000000"/>
@@ -1252,7 +1248,7 @@
             <w:pPr>
               <w:pStyle w:val="normal1"/>
               <w:rPr>
-                <w:rFonts w:ascii="Arial" w:hAnsi="Arial" w:eastAsia="Arial" w:cs="Arial"/>
+                <w:rFonts w:ascii="Arial" w:hAnsi="Arial"/>
                 <w:sz w:val="18"/>
                 <w:szCs w:val="18"/>
               </w:rPr>
@@ -1270,14 +1266,14 @@
             <w:pPr>
               <w:pStyle w:val="normal1"/>
               <w:rPr>
-                <w:rFonts w:ascii="Arial" w:hAnsi="Arial" w:eastAsia="Arial" w:cs="Arial"/>
-                <w:sz w:val="18"/>
-                <w:szCs w:val="18"/>
-              </w:rPr>
-            </w:pPr>
-            <w:r>
-              <w:rPr>
-                <w:rFonts w:eastAsia="Arial" w:cs="Arial" w:ascii="Arial" w:hAnsi="Arial"/>
+                <w:rFonts w:ascii="Arial" w:hAnsi="Arial"/>
+                <w:sz w:val="18"/>
+                <w:szCs w:val="18"/>
+              </w:rPr>
+            </w:pPr>
+            <w:r>
+              <w:rPr>
+                <w:rFonts w:ascii="Arial" w:hAnsi="Arial"/>
                 <w:sz w:val="18"/>
                 <w:szCs w:val="18"/>
               </w:rPr>
@@ -1292,7 +1288,7 @@
         </w:trPr>
         <w:tc>
           <w:tcPr>
-            <w:tcW w:w="520" w:type="dxa"/>
+            <w:tcW w:w="518" w:type="dxa"/>
             <w:tcBorders>
               <w:left w:val="single" w:sz="4" w:space="0" w:color="000000"/>
               <w:bottom w:val="single" w:sz="4" w:space="0" w:color="000000"/>
@@ -1305,7 +1301,7 @@
               <w:pStyle w:val="normal1"/>
               <w:jc w:val="center"/>
               <w:rPr>
-                <w:rFonts w:ascii="Arial" w:hAnsi="Arial" w:eastAsia="Arial" w:cs="Arial"/>
+                <w:rFonts w:ascii="Arial" w:hAnsi="Arial"/>
                 <w:sz w:val="18"/>
                 <w:szCs w:val="18"/>
               </w:rPr>
@@ -1333,7 +1329,7 @@
             <w:pPr>
               <w:pStyle w:val="normal1"/>
               <w:rPr>
-                <w:rFonts w:ascii="Arial" w:hAnsi="Arial" w:eastAsia="Arial" w:cs="Arial"/>
+                <w:rFonts w:ascii="Arial" w:hAnsi="Arial"/>
                 <w:sz w:val="18"/>
                 <w:szCs w:val="18"/>
               </w:rPr>
@@ -1350,7 +1346,7 @@
         </w:tc>
         <w:tc>
           <w:tcPr>
-            <w:tcW w:w="4436" w:type="dxa"/>
+            <w:tcW w:w="4438" w:type="dxa"/>
             <w:tcBorders>
               <w:bottom w:val="single" w:sz="4" w:space="0" w:color="000000"/>
               <w:right w:val="single" w:sz="4" w:space="0" w:color="000000"/>
@@ -1382,7 +1378,7 @@
         </w:trPr>
         <w:tc>
           <w:tcPr>
-            <w:tcW w:w="520" w:type="dxa"/>
+            <w:tcW w:w="518" w:type="dxa"/>
             <w:tcBorders>
               <w:left w:val="single" w:sz="4" w:space="0" w:color="000000"/>
               <w:bottom w:val="single" w:sz="4" w:space="0" w:color="000000"/>
@@ -1422,7 +1418,7 @@
             <w:pPr>
               <w:pStyle w:val="normal1"/>
               <w:rPr>
-                <w:rFonts w:ascii="Arial" w:hAnsi="Arial" w:eastAsia="Arial" w:cs="Arial"/>
+                <w:rFonts w:ascii="Arial" w:hAnsi="Arial"/>
                 <w:sz w:val="18"/>
                 <w:szCs w:val="18"/>
               </w:rPr>
@@ -1439,7 +1435,7 @@
         </w:tc>
         <w:tc>
           <w:tcPr>
-            <w:tcW w:w="4436" w:type="dxa"/>
+            <w:tcW w:w="4438" w:type="dxa"/>
             <w:tcBorders>
               <w:bottom w:val="single" w:sz="4" w:space="0" w:color="000000"/>
               <w:right w:val="single" w:sz="4" w:space="0" w:color="000000"/>
@@ -1452,30 +1448,14 @@
               <w:keepNext w:val="false"/>
               <w:keepLines w:val="false"/>
               <w:widowControl/>
-              <w:pBdr/>
               <w:shd w:val="clear" w:fill="auto"/>
               <w:spacing w:lineRule="auto" w:line="259" w:before="21" w:after="0"/>
               <w:ind w:hanging="0" w:left="0" w:right="504"/>
               <w:jc w:val="left"/>
               <w:rPr>
-                <w:rFonts w:ascii="Arial" w:hAnsi="Arial" w:eastAsia="Arial" w:cs="Arial"/>
-                <w:b w:val="false"/>
-                <w:bCs w:val="false"/>
-                <w:i w:val="false"/>
-                <w:i w:val="false"/>
-                <w:iCs w:val="false"/>
-                <w:caps w:val="false"/>
-                <w:smallCaps w:val="false"/>
-                <w:strike w:val="false"/>
-                <w:dstrike w:val="false"/>
-                <w:color w:val="000000"/>
-                <w:position w:val="0"/>
-                <w:sz w:val="18"/>
-                <w:sz w:val="18"/>
-                <w:szCs w:val="18"/>
-                <w:u w:val="none"/>
-                <w:shd w:fill="auto" w:val="clear"/>
-                <w:vertAlign w:val="baseline"/>
+                <w:rFonts w:ascii="Arial" w:hAnsi="Arial"/>
+                <w:sz w:val="18"/>
+                <w:szCs w:val="18"/>
               </w:rPr>
             </w:pPr>
             <w:r>
@@ -1525,7 +1505,7 @@
         </w:trPr>
         <w:tc>
           <w:tcPr>
-            <w:tcW w:w="520" w:type="dxa"/>
+            <w:tcW w:w="518" w:type="dxa"/>
             <w:tcBorders>
               <w:left w:val="single" w:sz="4" w:space="0" w:color="000000"/>
               <w:bottom w:val="single" w:sz="4" w:space="0" w:color="000000"/>
@@ -1565,7 +1545,7 @@
             <w:pPr>
               <w:pStyle w:val="normal1"/>
               <w:rPr>
-                <w:rFonts w:ascii="Arial" w:hAnsi="Arial" w:eastAsia="Arial" w:cs="Arial"/>
+                <w:rFonts w:ascii="Arial" w:hAnsi="Arial"/>
                 <w:sz w:val="18"/>
                 <w:szCs w:val="18"/>
               </w:rPr>
@@ -1582,18 +1562,18 @@
         </w:tc>
         <w:tc>
           <w:tcPr>
-            <w:tcW w:w="4436" w:type="dxa"/>
-            <w:tcBorders>
-              <w:bottom w:val="single" w:sz="4" w:space="0" w:color="000000"/>
-              <w:right w:val="single" w:sz="4" w:space="0" w:color="000000"/>
-            </w:tcBorders>
-            <w:vAlign w:val="center"/>
-          </w:tcPr>
-          <w:p>
-            <w:pPr>
-              <w:pStyle w:val="normal1"/>
-              <w:rPr>
-                <w:rFonts w:ascii="Arial" w:hAnsi="Arial" w:eastAsia="Arial" w:cs="Arial"/>
+            <w:tcW w:w="4438" w:type="dxa"/>
+            <w:tcBorders>
+              <w:bottom w:val="single" w:sz="4" w:space="0" w:color="000000"/>
+              <w:right w:val="single" w:sz="4" w:space="0" w:color="000000"/>
+            </w:tcBorders>
+            <w:vAlign w:val="center"/>
+          </w:tcPr>
+          <w:p>
+            <w:pPr>
+              <w:pStyle w:val="normal1"/>
+              <w:rPr>
+                <w:rFonts w:ascii="Arial" w:hAnsi="Arial"/>
                 <w:sz w:val="18"/>
                 <w:szCs w:val="18"/>
               </w:rPr>
@@ -1615,7 +1595,7 @@
         </w:trPr>
         <w:tc>
           <w:tcPr>
-            <w:tcW w:w="520" w:type="dxa"/>
+            <w:tcW w:w="518" w:type="dxa"/>
             <w:tcBorders>
               <w:left w:val="single" w:sz="4" w:space="0" w:color="000000"/>
               <w:bottom w:val="single" w:sz="4" w:space="0" w:color="000000"/>
@@ -1655,7 +1635,7 @@
             <w:pPr>
               <w:pStyle w:val="normal1"/>
               <w:rPr>
-                <w:rFonts w:ascii="Arial" w:hAnsi="Arial" w:eastAsia="Arial" w:cs="Arial"/>
+                <w:rFonts w:ascii="Arial" w:hAnsi="Arial"/>
                 <w:sz w:val="18"/>
                 <w:szCs w:val="18"/>
               </w:rPr>
@@ -1672,7 +1652,7 @@
         </w:tc>
         <w:tc>
           <w:tcPr>
-            <w:tcW w:w="4436" w:type="dxa"/>
+            <w:tcW w:w="4438" w:type="dxa"/>
             <w:tcBorders>
               <w:left w:val="single" w:sz="4" w:space="0" w:color="000000"/>
               <w:bottom w:val="single" w:sz="4" w:space="0" w:color="000000"/>
@@ -1684,7 +1664,7 @@
             <w:pPr>
               <w:pStyle w:val="normal1"/>
               <w:rPr>
-                <w:rFonts w:ascii="Arial" w:hAnsi="Arial" w:eastAsia="Arial" w:cs="Arial"/>
+                <w:rFonts w:ascii="Arial" w:hAnsi="Arial"/>
                 <w:sz w:val="18"/>
                 <w:szCs w:val="18"/>
               </w:rPr>
@@ -1706,7 +1686,7 @@
         </w:trPr>
         <w:tc>
           <w:tcPr>
-            <w:tcW w:w="520" w:type="dxa"/>
+            <w:tcW w:w="518" w:type="dxa"/>
             <w:tcBorders>
               <w:left w:val="single" w:sz="4" w:space="0" w:color="000000"/>
               <w:bottom w:val="single" w:sz="4" w:space="0" w:color="000000"/>
@@ -1719,7 +1699,7 @@
               <w:pStyle w:val="normal1"/>
               <w:jc w:val="center"/>
               <w:rPr>
-                <w:rFonts w:ascii="Arial" w:hAnsi="Arial" w:eastAsia="Arial" w:cs="Arial"/>
+                <w:rFonts w:ascii="Arial" w:hAnsi="Arial"/>
                 <w:sz w:val="18"/>
                 <w:szCs w:val="18"/>
               </w:rPr>
@@ -1747,7 +1727,7 @@
             <w:pPr>
               <w:pStyle w:val="normal1"/>
               <w:rPr>
-                <w:rFonts w:ascii="Arial" w:hAnsi="Arial" w:eastAsia="Arial" w:cs="Arial"/>
+                <w:rFonts w:ascii="Arial" w:hAnsi="Arial"/>
                 <w:sz w:val="18"/>
                 <w:szCs w:val="18"/>
               </w:rPr>
@@ -1764,18 +1744,18 @@
         </w:tc>
         <w:tc>
           <w:tcPr>
-            <w:tcW w:w="4436" w:type="dxa"/>
-            <w:tcBorders>
-              <w:bottom w:val="single" w:sz="4" w:space="0" w:color="000000"/>
-              <w:right w:val="single" w:sz="4" w:space="0" w:color="000000"/>
-            </w:tcBorders>
-            <w:vAlign w:val="center"/>
-          </w:tcPr>
-          <w:p>
-            <w:pPr>
-              <w:pStyle w:val="normal1"/>
-              <w:rPr>
-                <w:rFonts w:ascii="Arial" w:hAnsi="Arial" w:eastAsia="Arial" w:cs="Arial"/>
+            <w:tcW w:w="4438" w:type="dxa"/>
+            <w:tcBorders>
+              <w:bottom w:val="single" w:sz="4" w:space="0" w:color="000000"/>
+              <w:right w:val="single" w:sz="4" w:space="0" w:color="000000"/>
+            </w:tcBorders>
+            <w:vAlign w:val="center"/>
+          </w:tcPr>
+          <w:p>
+            <w:pPr>
+              <w:pStyle w:val="normal1"/>
+              <w:rPr>
+                <w:rFonts w:ascii="Arial" w:hAnsi="Arial"/>
                 <w:sz w:val="18"/>
                 <w:szCs w:val="18"/>
               </w:rPr>
@@ -1797,7 +1777,7 @@
         </w:trPr>
         <w:tc>
           <w:tcPr>
-            <w:tcW w:w="520" w:type="dxa"/>
+            <w:tcW w:w="518" w:type="dxa"/>
             <w:tcBorders>
               <w:left w:val="single" w:sz="4" w:space="0" w:color="000000"/>
               <w:bottom w:val="single" w:sz="4" w:space="0" w:color="000000"/>
@@ -1837,7 +1817,7 @@
             <w:pPr>
               <w:pStyle w:val="normal1"/>
               <w:rPr>
-                <w:rFonts w:ascii="Arial" w:hAnsi="Arial" w:eastAsia="Arial" w:cs="Arial"/>
+                <w:rFonts w:ascii="Arial" w:hAnsi="Arial"/>
                 <w:sz w:val="18"/>
                 <w:szCs w:val="18"/>
               </w:rPr>
@@ -1854,20 +1834,18 @@
         </w:tc>
         <w:tc>
           <w:tcPr>
-            <w:tcW w:w="4436" w:type="dxa"/>
-            <w:tcBorders>
-              <w:bottom w:val="single" w:sz="4" w:space="0" w:color="000000"/>
-              <w:right w:val="single" w:sz="4" w:space="0" w:color="000000"/>
-            </w:tcBorders>
-            <w:vAlign w:val="center"/>
-          </w:tcPr>
-          <w:p>
-            <w:pPr>
-              <w:pStyle w:val="normal1"/>
-              <w:rPr>
-                <w:rFonts w:ascii="Arial" w:hAnsi="Arial" w:eastAsia="Arial" w:cs="Arial"/>
-                <w:b/>
-                <w:bCs/>
+            <w:tcW w:w="4438" w:type="dxa"/>
+            <w:tcBorders>
+              <w:bottom w:val="single" w:sz="4" w:space="0" w:color="000000"/>
+              <w:right w:val="single" w:sz="4" w:space="0" w:color="000000"/>
+            </w:tcBorders>
+            <w:vAlign w:val="center"/>
+          </w:tcPr>
+          <w:p>
+            <w:pPr>
+              <w:pStyle w:val="normal1"/>
+              <w:rPr>
+                <w:rFonts w:ascii="Arial" w:hAnsi="Arial"/>
                 <w:sz w:val="18"/>
                 <w:szCs w:val="18"/>
               </w:rPr>
@@ -1889,7 +1867,7 @@
         </w:trPr>
         <w:tc>
           <w:tcPr>
-            <w:tcW w:w="520" w:type="dxa"/>
+            <w:tcW w:w="518" w:type="dxa"/>
             <w:tcBorders>
               <w:left w:val="single" w:sz="4" w:space="0" w:color="000000"/>
               <w:bottom w:val="single" w:sz="4" w:space="0" w:color="000000"/>
@@ -1929,7 +1907,7 @@
             <w:pPr>
               <w:pStyle w:val="normal1"/>
               <w:rPr>
-                <w:rFonts w:ascii="Arial" w:hAnsi="Arial" w:eastAsia="Arial" w:cs="Arial"/>
+                <w:rFonts w:ascii="Arial" w:hAnsi="Arial"/>
                 <w:sz w:val="18"/>
                 <w:szCs w:val="18"/>
               </w:rPr>
@@ -1946,18 +1924,18 @@
         </w:tc>
         <w:tc>
           <w:tcPr>
-            <w:tcW w:w="4436" w:type="dxa"/>
-            <w:tcBorders>
-              <w:bottom w:val="single" w:sz="4" w:space="0" w:color="000000"/>
-              <w:right w:val="single" w:sz="4" w:space="0" w:color="000000"/>
-            </w:tcBorders>
-            <w:vAlign w:val="center"/>
-          </w:tcPr>
-          <w:p>
-            <w:pPr>
-              <w:pStyle w:val="normal1"/>
-              <w:rPr>
-                <w:rFonts w:ascii="Arial" w:hAnsi="Arial" w:eastAsia="Arial" w:cs="Arial"/>
+            <w:tcW w:w="4438" w:type="dxa"/>
+            <w:tcBorders>
+              <w:bottom w:val="single" w:sz="4" w:space="0" w:color="000000"/>
+              <w:right w:val="single" w:sz="4" w:space="0" w:color="000000"/>
+            </w:tcBorders>
+            <w:vAlign w:val="center"/>
+          </w:tcPr>
+          <w:p>
+            <w:pPr>
+              <w:pStyle w:val="normal1"/>
+              <w:rPr>
+                <w:rFonts w:ascii="Arial" w:hAnsi="Arial"/>
                 <w:sz w:val="18"/>
                 <w:szCs w:val="18"/>
               </w:rPr>
@@ -1979,7 +1957,7 @@
         </w:trPr>
         <w:tc>
           <w:tcPr>
-            <w:tcW w:w="520" w:type="dxa"/>
+            <w:tcW w:w="518" w:type="dxa"/>
             <w:tcBorders>
               <w:left w:val="single" w:sz="4" w:space="0" w:color="000000"/>
               <w:bottom w:val="single" w:sz="4" w:space="0" w:color="000000"/>
@@ -1992,7 +1970,7 @@
               <w:pStyle w:val="normal1"/>
               <w:jc w:val="center"/>
               <w:rPr>
-                <w:rFonts w:ascii="Arial" w:hAnsi="Arial" w:eastAsia="Arial" w:cs="Arial"/>
+                <w:rFonts w:ascii="Arial" w:hAnsi="Arial"/>
                 <w:sz w:val="18"/>
                 <w:szCs w:val="18"/>
               </w:rPr>
@@ -2020,7 +1998,7 @@
             <w:pPr>
               <w:pStyle w:val="normal1"/>
               <w:rPr>
-                <w:rFonts w:ascii="Arial" w:hAnsi="Arial" w:eastAsia="Arial" w:cs="Arial"/>
+                <w:rFonts w:ascii="Arial" w:hAnsi="Arial"/>
                 <w:sz w:val="18"/>
                 <w:szCs w:val="18"/>
               </w:rPr>
@@ -2037,18 +2015,20 @@
         </w:tc>
         <w:tc>
           <w:tcPr>
-            <w:tcW w:w="4436" w:type="dxa"/>
-            <w:tcBorders>
-              <w:bottom w:val="single" w:sz="4" w:space="0" w:color="000000"/>
-              <w:right w:val="single" w:sz="4" w:space="0" w:color="000000"/>
-            </w:tcBorders>
-            <w:vAlign w:val="center"/>
-          </w:tcPr>
-          <w:p>
-            <w:pPr>
-              <w:pStyle w:val="normal1"/>
-              <w:rPr>
-                <w:color w:val="000000"/>
+            <w:tcW w:w="4438" w:type="dxa"/>
+            <w:tcBorders>
+              <w:bottom w:val="single" w:sz="4" w:space="0" w:color="000000"/>
+              <w:right w:val="single" w:sz="4" w:space="0" w:color="000000"/>
+            </w:tcBorders>
+            <w:vAlign w:val="center"/>
+          </w:tcPr>
+          <w:p>
+            <w:pPr>
+              <w:pStyle w:val="normal1"/>
+              <w:rPr>
+                <w:rFonts w:ascii="Arial" w:hAnsi="Arial"/>
+                <w:sz w:val="18"/>
+                <w:szCs w:val="18"/>
               </w:rPr>
             </w:pPr>
             <w:r>
@@ -2078,7 +2058,7 @@
         </w:trPr>
         <w:tc>
           <w:tcPr>
-            <w:tcW w:w="520" w:type="dxa"/>
+            <w:tcW w:w="518" w:type="dxa"/>
             <w:tcBorders>
               <w:left w:val="single" w:sz="4" w:space="0" w:color="000000"/>
               <w:bottom w:val="single" w:sz="4" w:space="0" w:color="000000"/>
@@ -2091,7 +2071,7 @@
               <w:pStyle w:val="normal1"/>
               <w:jc w:val="center"/>
               <w:rPr>
-                <w:rFonts w:ascii="Arial" w:hAnsi="Arial" w:eastAsia="Arial" w:cs="Arial"/>
+                <w:rFonts w:ascii="Arial" w:hAnsi="Arial"/>
                 <w:sz w:val="18"/>
                 <w:szCs w:val="18"/>
               </w:rPr>
@@ -2119,7 +2099,7 @@
             <w:pPr>
               <w:pStyle w:val="normal1"/>
               <w:rPr>
-                <w:rFonts w:ascii="Arial" w:hAnsi="Arial" w:eastAsia="Arial" w:cs="Arial"/>
+                <w:rFonts w:ascii="Arial" w:hAnsi="Arial"/>
                 <w:sz w:val="18"/>
                 <w:szCs w:val="18"/>
               </w:rPr>
@@ -2136,18 +2116,20 @@
         </w:tc>
         <w:tc>
           <w:tcPr>
-            <w:tcW w:w="4436" w:type="dxa"/>
-            <w:tcBorders>
-              <w:bottom w:val="single" w:sz="4" w:space="0" w:color="000000"/>
-              <w:right w:val="single" w:sz="4" w:space="0" w:color="000000"/>
-            </w:tcBorders>
-            <w:vAlign w:val="center"/>
-          </w:tcPr>
-          <w:p>
-            <w:pPr>
-              <w:pStyle w:val="normal1"/>
-              <w:rPr>
-                <w:color w:val="000000"/>
+            <w:tcW w:w="4438" w:type="dxa"/>
+            <w:tcBorders>
+              <w:bottom w:val="single" w:sz="4" w:space="0" w:color="000000"/>
+              <w:right w:val="single" w:sz="4" w:space="0" w:color="000000"/>
+            </w:tcBorders>
+            <w:vAlign w:val="center"/>
+          </w:tcPr>
+          <w:p>
+            <w:pPr>
+              <w:pStyle w:val="normal1"/>
+              <w:rPr>
+                <w:rFonts w:ascii="Arial" w:hAnsi="Arial"/>
+                <w:sz w:val="18"/>
+                <w:szCs w:val="18"/>
               </w:rPr>
             </w:pPr>
             <w:r>
@@ -2168,7 +2150,7 @@
         </w:trPr>
         <w:tc>
           <w:tcPr>
-            <w:tcW w:w="520" w:type="dxa"/>
+            <w:tcW w:w="518" w:type="dxa"/>
             <w:tcBorders>
               <w:left w:val="single" w:sz="4" w:space="0" w:color="000000"/>
               <w:bottom w:val="single" w:sz="4" w:space="0" w:color="000000"/>
@@ -2181,7 +2163,7 @@
               <w:pStyle w:val="normal1"/>
               <w:jc w:val="center"/>
               <w:rPr>
-                <w:rFonts w:ascii="Arial" w:hAnsi="Arial" w:eastAsia="Arial" w:cs="Arial"/>
+                <w:rFonts w:ascii="Arial" w:hAnsi="Arial"/>
                 <w:sz w:val="18"/>
                 <w:szCs w:val="18"/>
               </w:rPr>
@@ -2209,7 +2191,7 @@
             <w:pPr>
               <w:pStyle w:val="normal1"/>
               <w:rPr>
-                <w:rFonts w:ascii="Arial" w:hAnsi="Arial" w:eastAsia="Arial" w:cs="Arial"/>
+                <w:rFonts w:ascii="Arial" w:hAnsi="Arial"/>
                 <w:sz w:val="18"/>
                 <w:szCs w:val="18"/>
               </w:rPr>
@@ -2226,18 +2208,20 @@
         </w:tc>
         <w:tc>
           <w:tcPr>
-            <w:tcW w:w="4436" w:type="dxa"/>
-            <w:tcBorders>
-              <w:bottom w:val="single" w:sz="4" w:space="0" w:color="000000"/>
-              <w:right w:val="single" w:sz="4" w:space="0" w:color="000000"/>
-            </w:tcBorders>
-            <w:vAlign w:val="center"/>
-          </w:tcPr>
-          <w:p>
-            <w:pPr>
-              <w:pStyle w:val="normal1"/>
-              <w:rPr>
-                <w:color w:val="000000"/>
+            <w:tcW w:w="4438" w:type="dxa"/>
+            <w:tcBorders>
+              <w:bottom w:val="single" w:sz="4" w:space="0" w:color="000000"/>
+              <w:right w:val="single" w:sz="4" w:space="0" w:color="000000"/>
+            </w:tcBorders>
+            <w:vAlign w:val="center"/>
+          </w:tcPr>
+          <w:p>
+            <w:pPr>
+              <w:pStyle w:val="normal1"/>
+              <w:rPr>
+                <w:rFonts w:ascii="Arial" w:hAnsi="Arial"/>
+                <w:sz w:val="18"/>
+                <w:szCs w:val="18"/>
               </w:rPr>
             </w:pPr>
             <w:r>
@@ -2258,7 +2242,7 @@
         </w:trPr>
         <w:tc>
           <w:tcPr>
-            <w:tcW w:w="520" w:type="dxa"/>
+            <w:tcW w:w="518" w:type="dxa"/>
             <w:tcBorders>
               <w:left w:val="single" w:sz="4" w:space="0" w:color="000000"/>
               <w:bottom w:val="single" w:sz="4" w:space="0" w:color="000000"/>
@@ -2271,7 +2255,7 @@
               <w:pStyle w:val="normal1"/>
               <w:jc w:val="center"/>
               <w:rPr>
-                <w:rFonts w:ascii="Arial" w:hAnsi="Arial" w:eastAsia="Arial" w:cs="Arial"/>
+                <w:rFonts w:ascii="Arial" w:hAnsi="Arial"/>
                 <w:sz w:val="18"/>
                 <w:szCs w:val="18"/>
               </w:rPr>
@@ -2299,7 +2283,7 @@
             <w:pPr>
               <w:pStyle w:val="normal1"/>
               <w:rPr>
-                <w:rFonts w:ascii="Arial" w:hAnsi="Arial" w:eastAsia="Arial" w:cs="Arial"/>
+                <w:rFonts w:ascii="Arial" w:hAnsi="Arial"/>
                 <w:sz w:val="18"/>
                 <w:szCs w:val="18"/>
               </w:rPr>
@@ -2316,18 +2300,18 @@
         </w:tc>
         <w:tc>
           <w:tcPr>
-            <w:tcW w:w="4436" w:type="dxa"/>
-            <w:tcBorders>
-              <w:bottom w:val="single" w:sz="4" w:space="0" w:color="000000"/>
-              <w:right w:val="single" w:sz="4" w:space="0" w:color="000000"/>
-            </w:tcBorders>
-            <w:vAlign w:val="center"/>
-          </w:tcPr>
-          <w:p>
-            <w:pPr>
-              <w:pStyle w:val="normal1"/>
-              <w:rPr>
-                <w:rFonts w:ascii="Arial" w:hAnsi="Arial" w:eastAsia="Arial" w:cs="Arial"/>
+            <w:tcW w:w="4438" w:type="dxa"/>
+            <w:tcBorders>
+              <w:bottom w:val="single" w:sz="4" w:space="0" w:color="000000"/>
+              <w:right w:val="single" w:sz="4" w:space="0" w:color="000000"/>
+            </w:tcBorders>
+            <w:vAlign w:val="center"/>
+          </w:tcPr>
+          <w:p>
+            <w:pPr>
+              <w:pStyle w:val="normal1"/>
+              <w:rPr>
+                <w:rFonts w:ascii="Arial" w:hAnsi="Arial"/>
                 <w:sz w:val="18"/>
                 <w:szCs w:val="18"/>
               </w:rPr>
@@ -2349,7 +2333,7 @@
         </w:trPr>
         <w:tc>
           <w:tcPr>
-            <w:tcW w:w="520" w:type="dxa"/>
+            <w:tcW w:w="518" w:type="dxa"/>
             <w:tcBorders>
               <w:left w:val="single" w:sz="4" w:space="0" w:color="000000"/>
               <w:bottom w:val="single" w:sz="4" w:space="0" w:color="000000"/>
@@ -2389,7 +2373,7 @@
             <w:pPr>
               <w:pStyle w:val="normal1"/>
               <w:rPr>
-                <w:rFonts w:ascii="Arial" w:hAnsi="Arial" w:eastAsia="Arial" w:cs="Arial"/>
+                <w:rFonts w:ascii="Arial" w:hAnsi="Arial"/>
                 <w:sz w:val="18"/>
                 <w:szCs w:val="18"/>
               </w:rPr>
@@ -2406,18 +2390,18 @@
         </w:tc>
         <w:tc>
           <w:tcPr>
-            <w:tcW w:w="4436" w:type="dxa"/>
-            <w:tcBorders>
-              <w:bottom w:val="single" w:sz="4" w:space="0" w:color="000000"/>
-              <w:right w:val="single" w:sz="4" w:space="0" w:color="000000"/>
-            </w:tcBorders>
-            <w:vAlign w:val="center"/>
-          </w:tcPr>
-          <w:p>
-            <w:pPr>
-              <w:pStyle w:val="normal1"/>
-              <w:rPr>
-                <w:rFonts w:ascii="Arial" w:hAnsi="Arial" w:eastAsia="Arial" w:cs="Arial"/>
+            <w:tcW w:w="4438" w:type="dxa"/>
+            <w:tcBorders>
+              <w:bottom w:val="single" w:sz="4" w:space="0" w:color="000000"/>
+              <w:right w:val="single" w:sz="4" w:space="0" w:color="000000"/>
+            </w:tcBorders>
+            <w:vAlign w:val="center"/>
+          </w:tcPr>
+          <w:p>
+            <w:pPr>
+              <w:pStyle w:val="normal1"/>
+              <w:rPr>
+                <w:rFonts w:ascii="Arial" w:hAnsi="Arial"/>
                 <w:sz w:val="18"/>
                 <w:szCs w:val="18"/>
               </w:rPr>
@@ -2439,7 +2423,7 @@
         </w:trPr>
         <w:tc>
           <w:tcPr>
-            <w:tcW w:w="520" w:type="dxa"/>
+            <w:tcW w:w="518" w:type="dxa"/>
             <w:vMerge w:val="restart"/>
             <w:tcBorders>
               <w:top w:val="single" w:sz="4" w:space="0" w:color="000000"/>
@@ -2453,7 +2437,7 @@
               <w:pStyle w:val="normal1"/>
               <w:jc w:val="center"/>
               <w:rPr>
-                <w:rFonts w:ascii="Arial" w:hAnsi="Arial" w:eastAsia="Arial" w:cs="Arial"/>
+                <w:rFonts w:ascii="Arial" w:hAnsi="Arial"/>
                 <w:sz w:val="18"/>
                 <w:szCs w:val="18"/>
               </w:rPr>
@@ -2482,7 +2466,7 @@
             <w:pPr>
               <w:pStyle w:val="normal1"/>
               <w:rPr>
-                <w:rFonts w:ascii="Arial" w:hAnsi="Arial" w:eastAsia="Arial" w:cs="Arial"/>
+                <w:rFonts w:ascii="Arial" w:hAnsi="Arial"/>
                 <w:sz w:val="18"/>
                 <w:szCs w:val="18"/>
               </w:rPr>
@@ -2499,7 +2483,7 @@
         </w:tc>
         <w:tc>
           <w:tcPr>
-            <w:tcW w:w="4436" w:type="dxa"/>
+            <w:tcW w:w="4438" w:type="dxa"/>
             <w:tcBorders>
               <w:top w:val="single" w:sz="4" w:space="0" w:color="000000"/>
               <w:bottom w:val="single" w:sz="4" w:space="0" w:color="000000"/>
@@ -2532,7 +2516,7 @@
         </w:trPr>
         <w:tc>
           <w:tcPr>
-            <w:tcW w:w="520" w:type="dxa"/>
+            <w:tcW w:w="518" w:type="dxa"/>
             <w:vMerge w:val="continue"/>
             <w:tcBorders>
               <w:top w:val="single" w:sz="4" w:space="0" w:color="000000"/>
@@ -2547,7 +2531,6 @@
               <w:keepNext w:val="false"/>
               <w:keepLines w:val="false"/>
               <w:widowControl w:val="false"/>
-              <w:pBdr/>
               <w:shd w:val="clear" w:fill="auto"/>
               <w:spacing w:lineRule="auto" w:line="276" w:before="0" w:after="0"/>
               <w:ind w:hanging="0" w:left="0" w:right="0"/>
@@ -2569,7 +2552,7 @@
         </w:tc>
         <w:tc>
           <w:tcPr>
-            <w:tcW w:w="3113" w:type="dxa"/>
+            <w:tcW w:w="4905" w:type="dxa"/>
             <w:tcBorders>
               <w:top w:val="single" w:sz="4" w:space="0" w:color="000000"/>
               <w:bottom w:val="single" w:sz="4" w:space="0" w:color="000000"/>
@@ -2581,76 +2564,50 @@
             <w:pPr>
               <w:pStyle w:val="normal1"/>
               <w:rPr>
+                <w:rFonts w:ascii="Arial" w:hAnsi="Arial"/>
+                <w:sz w:val="18"/>
+                <w:szCs w:val="18"/>
+              </w:rPr>
+            </w:pPr>
+            <w:r>
+              <w:rPr>
+                <w:rFonts w:eastAsia="Arial" w:cs="Arial" w:ascii="Arial" w:hAnsi="Arial"/>
+                <w:sz w:val="18"/>
+                <w:szCs w:val="18"/>
+              </w:rPr>
+              <w:t>{{ vehicle_models_list }}</w:t>
+            </w:r>
+          </w:p>
+        </w:tc>
+        <w:tc>
+          <w:tcPr>
+            <w:tcW w:w="4438" w:type="dxa"/>
+            <w:tcBorders>
+              <w:top w:val="single" w:sz="4" w:space="0" w:color="000000"/>
+              <w:bottom w:val="single" w:sz="4" w:space="0" w:color="000000"/>
+              <w:right w:val="single" w:sz="4" w:space="0" w:color="000000"/>
+            </w:tcBorders>
+            <w:vAlign w:val="center"/>
+          </w:tcPr>
+          <w:p>
+            <w:pPr>
+              <w:pStyle w:val="normal1"/>
+              <w:rPr>
                 <w:rFonts w:ascii="Arial" w:hAnsi="Arial" w:eastAsia="Arial" w:cs="Arial"/>
-                <w:sz w:val="18"/>
-                <w:szCs w:val="18"/>
-              </w:rPr>
-            </w:pPr>
-            <w:r>
-              <w:rPr>
-                <w:rFonts w:eastAsia="Arial" w:cs="Arial" w:ascii="Arial" w:hAnsi="Arial"/>
-                <w:sz w:val="18"/>
-                <w:szCs w:val="18"/>
-              </w:rPr>
-              <w:t xml:space="preserve">{% if vehicle_models_columns|length &gt; 0 %}{{ vehicle_models_columns[0] }}{% endif %}</w:t>
-            </w:r>
-          </w:p>
-        </w:tc>
-        <w:tc>
-          <w:tcPr>
-            <w:tcW w:w="3113" w:type="dxa"/>
-            <w:tcBorders>
-              <w:top w:val="single" w:sz="4" w:space="0" w:color="000000"/>
-              <w:bottom w:val="single" w:sz="4" w:space="0" w:color="000000"/>
-              <w:right w:val="single" w:sz="4" w:space="0" w:color="000000"/>
-            </w:tcBorders>
-            <w:vAlign w:val="center"/>
-          </w:tcPr>
-          <w:p>
-            <w:pPr>
-              <w:pStyle w:val="normal1"/>
-              <w:rPr>
-                <w:rFonts w:ascii="Arial" w:hAnsi="Arial" w:eastAsia="Arial" w:cs="Arial"/>
-                <w:sz w:val="18"/>
-                <w:szCs w:val="18"/>
-              </w:rPr>
-            </w:pPr>
-            <w:r>
-              <w:rPr>
-                <w:rFonts w:eastAsia="Arial" w:cs="Arial" w:ascii="Arial" w:hAnsi="Arial"/>
-                <w:sz w:val="18"/>
-                <w:szCs w:val="18"/>
-              </w:rPr>
-              <w:t xml:space="preserve">{% if vehicle_models_columns|length &gt; 1 %}{{ vehicle_models_columns[1] }}{% endif %}</w:t>
-            </w:r>
-          </w:p>
-        </w:tc>
-        <w:tc>
-          <w:tcPr>
-            <w:tcW w:w="3115" w:type="dxa"/>
-            <w:tcBorders>
-              <w:top w:val="single" w:sz="4" w:space="0" w:color="000000"/>
-              <w:bottom w:val="single" w:sz="4" w:space="0" w:color="000000"/>
-              <w:right w:val="single" w:sz="4" w:space="0" w:color="000000"/>
-            </w:tcBorders>
-            <w:vAlign w:val="center"/>
-          </w:tcPr>
-          <w:p>
-            <w:pPr>
-              <w:pStyle w:val="normal1"/>
-              <w:rPr>
-                <w:rFonts w:ascii="Arial" w:hAnsi="Arial" w:eastAsia="Arial" w:cs="Arial"/>
-                <w:sz w:val="18"/>
-                <w:szCs w:val="18"/>
-              </w:rPr>
-            </w:pPr>
-            <w:r>
-              <w:rPr>
-                <w:rFonts w:eastAsia="Arial" w:cs="Arial" w:ascii="Arial" w:hAnsi="Arial"/>
-                <w:sz w:val="18"/>
-                <w:szCs w:val="18"/>
-              </w:rPr>
-              <w:t xml:space="preserve">{% if vehicle_models_columns|length &gt; 2 %}{{ vehicle_models_columns[2:] | join("\n") }}{% endif %}</w:t>
+                <w:b/>
+                <w:bCs/>
+                <w:sz w:val="18"/>
+                <w:szCs w:val="18"/>
+              </w:rPr>
+            </w:pPr>
+            <w:r>
+              <w:rPr>
+                <w:rFonts w:eastAsia="Arial" w:cs="Arial" w:ascii="Arial" w:hAnsi="Arial"/>
+                <w:b/>
+                <w:bCs/>
+                <w:sz w:val="18"/>
+                <w:szCs w:val="18"/>
+              </w:rPr>
             </w:r>
           </w:p>
         </w:tc>
@@ -2661,7 +2618,7 @@
         </w:trPr>
         <w:tc>
           <w:tcPr>
-            <w:tcW w:w="5425" w:type="dxa"/>
+            <w:tcW w:w="5423" w:type="dxa"/>
             <w:gridSpan w:val="2"/>
             <w:tcBorders>
               <w:top w:val="single" w:sz="4" w:space="0" w:color="000000"/>
@@ -2673,20 +2630,18 @@
             <w:pPr>
               <w:pStyle w:val="normal1"/>
               <w:rPr>
-                <w:rFonts w:ascii="Arial" w:hAnsi="Arial" w:eastAsia="Arial" w:cs="Arial"/>
+                <w:rFonts w:ascii="Arial" w:hAnsi="Arial"/>
+                <w:sz w:val="18"/>
+                <w:szCs w:val="18"/>
+              </w:rPr>
+            </w:pPr>
+            <w:r>
+              <w:rPr>
+                <w:rFonts w:eastAsia="Arial" w:cs="Arial" w:ascii="Arial" w:hAnsi="Arial"/>
                 <w:b/>
                 <w:bCs/>
-                <w:sz w:val="20"/>
-                <w:szCs w:val="20"/>
-              </w:rPr>
-            </w:pPr>
-            <w:r>
-              <w:rPr>
-                <w:rFonts w:eastAsia="Arial" w:cs="Arial" w:ascii="Arial" w:hAnsi="Arial"/>
-                <w:b/>
-                <w:bCs/>
-                <w:sz w:val="20"/>
-                <w:szCs w:val="20"/>
+                <w:sz w:val="18"/>
+                <w:szCs w:val="18"/>
               </w:rPr>
               <w:t>For Horizon Enterprise</w:t>
             </w:r>
@@ -2694,7 +2649,7 @@
         </w:tc>
         <w:tc>
           <w:tcPr>
-            <w:tcW w:w="4436" w:type="dxa"/>
+            <w:tcW w:w="4438" w:type="dxa"/>
             <w:tcBorders>
               <w:top w:val="single" w:sz="4" w:space="0" w:color="000000"/>
               <w:right w:val="single" w:sz="4" w:space="0" w:color="000000"/>
@@ -2706,15 +2661,15 @@
               <w:pStyle w:val="normal1"/>
               <w:rPr>
                 <w:rFonts w:ascii="Arial" w:hAnsi="Arial" w:eastAsia="Arial" w:cs="Arial"/>
-                <w:sz w:val="20"/>
-                <w:szCs w:val="20"/>
-              </w:rPr>
-            </w:pPr>
-            <w:r>
-              <w:rPr>
-                <w:rFonts w:eastAsia="Arial" w:cs="Arial" w:ascii="Arial" w:hAnsi="Arial"/>
-                <w:sz w:val="20"/>
-                <w:szCs w:val="20"/>
+                <w:sz w:val="18"/>
+                <w:szCs w:val="18"/>
+              </w:rPr>
+            </w:pPr>
+            <w:r>
+              <w:rPr>
+                <w:rFonts w:eastAsia="Arial" w:cs="Arial" w:ascii="Arial" w:hAnsi="Arial"/>
+                <w:sz w:val="18"/>
+                <w:szCs w:val="18"/>
               </w:rPr>
             </w:r>
           </w:p>
@@ -2739,15 +2694,17 @@
             <w:pPr>
               <w:pStyle w:val="normal1"/>
               <w:rPr>
-                <w:rFonts w:ascii="Arial" w:hAnsi="Arial" w:eastAsia="Arial" w:cs="Arial"/>
-                <w:b/>
-                <w:bCs/>
-                <w:sz w:val="22"/>
-                <w:szCs w:val="22"/>
-              </w:rPr>
-            </w:pPr>
-            <w:r>
-              <w:rPr/>
+                <w:rFonts w:ascii="Arial" w:hAnsi="Arial"/>
+                <w:sz w:val="18"/>
+                <w:szCs w:val="18"/>
+              </w:rPr>
+            </w:pPr>
+            <w:r>
+              <w:rPr>
+                <w:rFonts w:ascii="Arial" w:hAnsi="Arial"/>
+                <w:sz w:val="18"/>
+                <w:szCs w:val="18"/>
+              </w:rPr>
               <w:drawing>
                 <wp:inline distT="0" distB="0" distL="0" distR="0">
                   <wp:extent cx="2178050" cy="876300"/>
@@ -2792,18 +2749,16 @@
             <w:pPr>
               <w:pStyle w:val="normal1"/>
               <w:rPr>
-                <w:rFonts w:ascii="Arial" w:hAnsi="Arial" w:eastAsia="Arial" w:cs="Arial"/>
-                <w:sz w:val="20"/>
-                <w:szCs w:val="20"/>
-              </w:rPr>
-            </w:pPr>
-            <w:r>
-              <w:rPr>
-                <w:rFonts w:eastAsia="Arial" w:cs="Arial" w:ascii="Arial" w:hAnsi="Arial"/>
-                <w:b/>
-                <w:bCs/>
-                <w:sz w:val="20"/>
-                <w:szCs w:val="20"/>
+                <w:rFonts w:ascii="Arial" w:hAnsi="Arial"/>
+                <w:sz w:val="18"/>
+                <w:szCs w:val="18"/>
+              </w:rPr>
+            </w:pPr>
+            <w:r>
+              <w:rPr>
+                <w:rFonts w:ascii="Arial" w:hAnsi="Arial"/>
+                <w:sz w:val="18"/>
+                <w:szCs w:val="18"/>
               </w:rPr>
               <w:t>Authorized Signatory</w:t>
             </w:r>
@@ -2835,7 +2790,6 @@
         <w:keepLines w:val="false"/>
         <w:pageBreakBefore w:val="false"/>
         <w:widowControl/>
-        <w:pBdr/>
         <w:shd w:val="clear" w:fill="auto"/>
         <w:spacing w:lineRule="auto" w:line="240" w:before="0" w:after="0"/>
         <w:ind w:hanging="0" w:left="0" w:right="0"/>
@@ -2906,7 +2860,7 @@
     <w:p>
       <w:pPr>
         <w:pStyle w:val="normal1"/>
-        <w:spacing w:lineRule="auto" w:line="98" w:before="4" w:after="0"/>
+        <w:spacing w:lineRule="auto" w:line="93" w:before="4" w:after="0"/>
         <w:rPr>
           <w:sz w:val="9"/>
           <w:szCs w:val="9"/>
@@ -2922,7 +2876,7 @@
     <w:p>
       <w:pPr>
         <w:pStyle w:val="normal1"/>
-        <w:spacing w:lineRule="auto" w:line="98" w:before="4" w:after="0"/>
+        <w:spacing w:lineRule="auto" w:line="93" w:before="4" w:after="0"/>
         <w:rPr>
           <w:sz w:val="9"/>
           <w:szCs w:val="9"/>
@@ -3014,7 +2968,6 @@
       <w:keepLines w:val="false"/>
       <w:pageBreakBefore w:val="false"/>
       <w:widowControl/>
-      <w:pBdr/>
       <w:shd w:val="clear" w:fill="auto"/>
       <w:tabs>
         <w:tab w:val="clear" w:pos="720"/>
@@ -3189,7 +3142,6 @@
       <w:keepLines w:val="false"/>
       <w:pageBreakBefore w:val="false"/>
       <w:widowControl/>
-      <w:pBdr/>
       <w:shd w:val="clear" w:fill="auto"/>
       <w:tabs>
         <w:tab w:val="clear" w:pos="720"/>
@@ -3341,7 +3293,6 @@
       <w:keepLines w:val="false"/>
       <w:pageBreakBefore w:val="false"/>
       <w:widowControl/>
-      <w:pBdr/>
       <w:shd w:val="clear" w:fill="auto"/>
       <w:tabs>
         <w:tab w:val="clear" w:pos="720"/>
@@ -3425,7 +3376,6 @@
       <w:keepLines w:val="false"/>
       <w:pageBreakBefore w:val="false"/>
       <w:widowControl/>
-      <w:pBdr/>
       <w:shd w:val="clear" w:fill="auto"/>
       <w:tabs>
         <w:tab w:val="clear" w:pos="720"/>
@@ -3522,6 +3472,7 @@
     <w:qFormat/>
     <w:pPr>
       <w:widowControl/>
+      <w:suppressAutoHyphens w:val="true"/>
       <w:bidi w:val="0"/>
       <w:spacing w:before="0" w:after="0"/>
       <w:jc w:val="left"/>
@@ -3712,6 +3663,7 @@
     <w:qFormat/>
     <w:pPr>
       <w:widowControl/>
+      <w:suppressAutoHyphens w:val="true"/>
       <w:bidi w:val="0"/>
       <w:spacing w:before="0" w:after="0"/>
       <w:jc w:val="left"/>

</xml_diff>

<commit_message>
price well structured + font style arial and font height 10px.
</commit_message>
<xml_diff>
--- a/templates/ANX C.docx
+++ b/templates/ANX C.docx
@@ -35,9 +35,9 @@
         <w:tblLook w:val="0400"/>
       </w:tblPr>
       <w:tblGrid>
-        <w:gridCol w:w="518"/>
+        <w:gridCol w:w="517"/>
         <w:gridCol w:w="4905"/>
-        <w:gridCol w:w="4438"/>
+        <w:gridCol w:w="4439"/>
       </w:tblGrid>
       <w:tr>
         <w:trPr>
@@ -60,9 +60,8 @@
               <w:pStyle w:val="normal1"/>
               <w:jc w:val="center"/>
               <w:rPr>
-                <w:rFonts w:ascii="Arial" w:hAnsi="Arial"/>
-                <w:sz w:val="18"/>
-                <w:szCs w:val="18"/>
+                <w:sz w:val="20"/>
+                <w:szCs w:val="20"/>
               </w:rPr>
             </w:pPr>
             <w:r>
@@ -70,8 +69,8 @@
                 <w:rFonts w:eastAsia="Arial" w:cs="Arial" w:ascii="Arial" w:hAnsi="Arial"/>
                 <w:b/>
                 <w:bCs/>
-                <w:sz w:val="18"/>
-                <w:szCs w:val="18"/>
+                <w:sz w:val="20"/>
+                <w:szCs w:val="20"/>
               </w:rPr>
               <w:t>ANNEXURE C</w:t>
             </w:r>
@@ -103,9 +102,8 @@
               </w:tabs>
               <w:jc w:val="center"/>
               <w:rPr>
-                <w:rFonts w:ascii="Arial" w:hAnsi="Arial"/>
-                <w:sz w:val="18"/>
-                <w:szCs w:val="18"/>
+                <w:sz w:val="20"/>
+                <w:szCs w:val="20"/>
               </w:rPr>
             </w:pPr>
             <w:r>
@@ -113,8 +111,8 @@
                 <w:rFonts w:eastAsia="Arial" w:cs="Arial" w:ascii="Arial" w:hAnsi="Arial"/>
                 <w:b/>
                 <w:bCs/>
-                <w:sz w:val="18"/>
-                <w:szCs w:val="18"/>
+                <w:sz w:val="20"/>
+                <w:szCs w:val="20"/>
               </w:rPr>
               <w:t>EXPORT UNDER SELF SEALING SCHEME</w:t>
             </w:r>
@@ -140,16 +138,15 @@
             <w:pPr>
               <w:pStyle w:val="normal1"/>
               <w:rPr>
-                <w:rFonts w:ascii="Arial" w:hAnsi="Arial"/>
-                <w:sz w:val="18"/>
-                <w:szCs w:val="18"/>
-              </w:rPr>
-            </w:pPr>
-            <w:r>
-              <w:rPr>
-                <w:rFonts w:eastAsia="Arial" w:cs="Arial" w:ascii="Arial" w:hAnsi="Arial"/>
-                <w:sz w:val="18"/>
-                <w:szCs w:val="18"/>
+                <w:sz w:val="20"/>
+                <w:szCs w:val="20"/>
+              </w:rPr>
+            </w:pPr>
+            <w:r>
+              <w:rPr>
+                <w:rFonts w:eastAsia="Arial" w:cs="Arial" w:ascii="Arial" w:hAnsi="Arial"/>
+                <w:sz w:val="20"/>
+                <w:szCs w:val="20"/>
               </w:rPr>
               <w:t xml:space="preserve">C.NO </w:t>
             </w:r>
@@ -157,8 +154,8 @@
               <w:rPr>
                 <w:rFonts w:eastAsia="Arial" w:cs="Arial" w:ascii="Arial" w:hAnsi="Arial"/>
                 <w:color w:val="000000"/>
-                <w:sz w:val="18"/>
-                <w:szCs w:val="18"/>
+                <w:sz w:val="20"/>
+                <w:szCs w:val="20"/>
               </w:rPr>
               <w:t>{{ container_no }}</w:t>
             </w:r>
@@ -166,16 +163,16 @@
               <w:rPr>
                 <w:rFonts w:eastAsia="Arial" w:cs="Arial" w:ascii="Arial" w:hAnsi="Arial"/>
                 <w:color w:val="EE0000"/>
-                <w:sz w:val="18"/>
-                <w:szCs w:val="18"/>
+                <w:sz w:val="20"/>
+                <w:szCs w:val="20"/>
               </w:rPr>
               <w:t xml:space="preserve"> </w:t>
             </w:r>
             <w:r>
               <w:rPr>
                 <w:rFonts w:eastAsia="Arial" w:cs="Arial" w:ascii="Arial" w:hAnsi="Arial"/>
-                <w:sz w:val="18"/>
-                <w:szCs w:val="18"/>
+                <w:sz w:val="20"/>
+                <w:szCs w:val="20"/>
               </w:rPr>
               <w:t>DT {{ invoice_date }}</w:t>
             </w:r>
@@ -201,16 +198,15 @@
             <w:pPr>
               <w:pStyle w:val="normal1"/>
               <w:rPr>
-                <w:rFonts w:ascii="Arial" w:hAnsi="Arial"/>
-                <w:sz w:val="18"/>
-                <w:szCs w:val="18"/>
-              </w:rPr>
-            </w:pPr>
-            <w:r>
-              <w:rPr>
-                <w:rFonts w:eastAsia="Arial" w:cs="Arial" w:ascii="Arial" w:hAnsi="Arial"/>
-                <w:sz w:val="18"/>
-                <w:szCs w:val="18"/>
+                <w:sz w:val="20"/>
+                <w:szCs w:val="20"/>
+              </w:rPr>
+            </w:pPr>
+            <w:r>
+              <w:rPr>
+                <w:rFonts w:eastAsia="Arial" w:cs="Arial" w:ascii="Arial" w:hAnsi="Arial"/>
+                <w:sz w:val="20"/>
+                <w:szCs w:val="20"/>
               </w:rPr>
               <w:t>Examination Report for the Self Sealing Container</w:t>
             </w:r>
@@ -236,16 +232,15 @@
             <w:pPr>
               <w:pStyle w:val="normal1"/>
               <w:rPr>
-                <w:rFonts w:ascii="Arial" w:hAnsi="Arial"/>
-                <w:sz w:val="18"/>
-                <w:szCs w:val="18"/>
-              </w:rPr>
-            </w:pPr>
-            <w:r>
-              <w:rPr>
-                <w:rFonts w:eastAsia="Arial" w:cs="Arial" w:ascii="Arial" w:hAnsi="Arial"/>
-                <w:sz w:val="18"/>
-                <w:szCs w:val="18"/>
+                <w:sz w:val="20"/>
+                <w:szCs w:val="20"/>
+              </w:rPr>
+            </w:pPr>
+            <w:r>
+              <w:rPr>
+                <w:rFonts w:eastAsia="Arial" w:cs="Arial" w:ascii="Arial" w:hAnsi="Arial"/>
+                <w:sz w:val="20"/>
+                <w:szCs w:val="20"/>
               </w:rPr>
               <w:t>F. No. VIII/48-01/S.S./ICD/2018-19 DT. 26.07.2018 VALID UPTO 24.07.2019.</w:t>
             </w:r>
@@ -258,7 +253,7 @@
         </w:trPr>
         <w:tc>
           <w:tcPr>
-            <w:tcW w:w="518" w:type="dxa"/>
+            <w:tcW w:w="517" w:type="dxa"/>
             <w:tcBorders>
               <w:left w:val="single" w:sz="4" w:space="0" w:color="000000"/>
               <w:bottom w:val="single" w:sz="4" w:space="0" w:color="000000"/>
@@ -271,16 +266,15 @@
               <w:pStyle w:val="normal1"/>
               <w:jc w:val="center"/>
               <w:rPr>
-                <w:rFonts w:ascii="Arial" w:hAnsi="Arial"/>
-                <w:sz w:val="18"/>
-                <w:szCs w:val="18"/>
-              </w:rPr>
-            </w:pPr>
-            <w:r>
-              <w:rPr>
-                <w:rFonts w:eastAsia="Arial" w:cs="Arial" w:ascii="Arial" w:hAnsi="Arial"/>
-                <w:sz w:val="18"/>
-                <w:szCs w:val="18"/>
+                <w:sz w:val="20"/>
+                <w:szCs w:val="20"/>
+              </w:rPr>
+            </w:pPr>
+            <w:r>
+              <w:rPr>
+                <w:rFonts w:eastAsia="Arial" w:cs="Arial" w:ascii="Arial" w:hAnsi="Arial"/>
+                <w:sz w:val="20"/>
+                <w:szCs w:val="20"/>
               </w:rPr>
               <w:t>1</w:t>
             </w:r>
@@ -299,16 +293,15 @@
             <w:pPr>
               <w:pStyle w:val="normal1"/>
               <w:rPr>
-                <w:rFonts w:ascii="Arial" w:hAnsi="Arial"/>
-                <w:sz w:val="18"/>
-                <w:szCs w:val="18"/>
-              </w:rPr>
-            </w:pPr>
-            <w:r>
-              <w:rPr>
-                <w:rFonts w:eastAsia="Arial" w:cs="Arial" w:ascii="Arial" w:hAnsi="Arial"/>
-                <w:sz w:val="18"/>
-                <w:szCs w:val="18"/>
+                <w:sz w:val="20"/>
+                <w:szCs w:val="20"/>
+              </w:rPr>
+            </w:pPr>
+            <w:r>
+              <w:rPr>
+                <w:rFonts w:eastAsia="Arial" w:cs="Arial" w:ascii="Arial" w:hAnsi="Arial"/>
+                <w:sz w:val="20"/>
+                <w:szCs w:val="20"/>
               </w:rPr>
               <w:t>NAME OF THE EXPORTER</w:t>
             </w:r>
@@ -316,27 +309,26 @@
         </w:tc>
         <w:tc>
           <w:tcPr>
-            <w:tcW w:w="4438" w:type="dxa"/>
-            <w:tcBorders>
-              <w:bottom w:val="single" w:sz="4" w:space="0" w:color="000000"/>
-              <w:right w:val="single" w:sz="4" w:space="0" w:color="000000"/>
-            </w:tcBorders>
-            <w:vAlign w:val="center"/>
-          </w:tcPr>
-          <w:p>
-            <w:pPr>
-              <w:pStyle w:val="normal1"/>
-              <w:rPr>
-                <w:rFonts w:ascii="Arial" w:hAnsi="Arial"/>
-                <w:sz w:val="18"/>
-                <w:szCs w:val="18"/>
-              </w:rPr>
-            </w:pPr>
-            <w:r>
-              <w:rPr>
-                <w:rFonts w:eastAsia="Arial" w:cs="Arial" w:ascii="Arial" w:hAnsi="Arial"/>
-                <w:sz w:val="18"/>
-                <w:szCs w:val="18"/>
+            <w:tcW w:w="4439" w:type="dxa"/>
+            <w:tcBorders>
+              <w:bottom w:val="single" w:sz="4" w:space="0" w:color="000000"/>
+              <w:right w:val="single" w:sz="4" w:space="0" w:color="000000"/>
+            </w:tcBorders>
+            <w:vAlign w:val="center"/>
+          </w:tcPr>
+          <w:p>
+            <w:pPr>
+              <w:pStyle w:val="normal1"/>
+              <w:rPr>
+                <w:sz w:val="20"/>
+                <w:szCs w:val="20"/>
+              </w:rPr>
+            </w:pPr>
+            <w:r>
+              <w:rPr>
+                <w:rFonts w:eastAsia="Arial" w:cs="Arial" w:ascii="Arial" w:hAnsi="Arial"/>
+                <w:sz w:val="20"/>
+                <w:szCs w:val="20"/>
               </w:rPr>
               <w:t>M/s Horizon Enterprise</w:t>
             </w:r>
@@ -349,7 +341,7 @@
         </w:trPr>
         <w:tc>
           <w:tcPr>
-            <w:tcW w:w="518" w:type="dxa"/>
+            <w:tcW w:w="517" w:type="dxa"/>
             <w:tcBorders>
               <w:left w:val="single" w:sz="4" w:space="0" w:color="000000"/>
               <w:bottom w:val="single" w:sz="4" w:space="0" w:color="000000"/>
@@ -362,16 +354,15 @@
               <w:pStyle w:val="normal1"/>
               <w:jc w:val="center"/>
               <w:rPr>
-                <w:rFonts w:ascii="Arial" w:hAnsi="Arial"/>
-                <w:sz w:val="18"/>
-                <w:szCs w:val="18"/>
-              </w:rPr>
-            </w:pPr>
-            <w:r>
-              <w:rPr>
-                <w:rFonts w:eastAsia="Arial" w:cs="Arial" w:ascii="Arial" w:hAnsi="Arial"/>
-                <w:sz w:val="18"/>
-                <w:szCs w:val="18"/>
+                <w:sz w:val="20"/>
+                <w:szCs w:val="20"/>
+              </w:rPr>
+            </w:pPr>
+            <w:r>
+              <w:rPr>
+                <w:rFonts w:eastAsia="Arial" w:cs="Arial" w:ascii="Arial" w:hAnsi="Arial"/>
+                <w:sz w:val="20"/>
+                <w:szCs w:val="20"/>
               </w:rPr>
               <w:t>2</w:t>
             </w:r>
@@ -390,16 +381,15 @@
             <w:pPr>
               <w:pStyle w:val="normal1"/>
               <w:rPr>
-                <w:rFonts w:ascii="Arial" w:hAnsi="Arial"/>
-                <w:sz w:val="18"/>
-                <w:szCs w:val="18"/>
-              </w:rPr>
-            </w:pPr>
-            <w:r>
-              <w:rPr>
-                <w:rFonts w:eastAsia="Arial" w:cs="Arial" w:ascii="Arial" w:hAnsi="Arial"/>
-                <w:sz w:val="18"/>
-                <w:szCs w:val="18"/>
+                <w:sz w:val="20"/>
+                <w:szCs w:val="20"/>
+              </w:rPr>
+            </w:pPr>
+            <w:r>
+              <w:rPr>
+                <w:rFonts w:eastAsia="Arial" w:cs="Arial" w:ascii="Arial" w:hAnsi="Arial"/>
+                <w:sz w:val="20"/>
+                <w:szCs w:val="20"/>
               </w:rPr>
               <w:t>a) IEC NO.</w:t>
             </w:r>
@@ -407,27 +397,26 @@
         </w:tc>
         <w:tc>
           <w:tcPr>
-            <w:tcW w:w="4438" w:type="dxa"/>
-            <w:tcBorders>
-              <w:bottom w:val="single" w:sz="4" w:space="0" w:color="000000"/>
-              <w:right w:val="single" w:sz="4" w:space="0" w:color="000000"/>
-            </w:tcBorders>
-            <w:vAlign w:val="center"/>
-          </w:tcPr>
-          <w:p>
-            <w:pPr>
-              <w:pStyle w:val="normal1"/>
-              <w:rPr>
-                <w:rFonts w:ascii="Arial" w:hAnsi="Arial"/>
-                <w:sz w:val="18"/>
-                <w:szCs w:val="18"/>
-              </w:rPr>
-            </w:pPr>
-            <w:r>
-              <w:rPr>
-                <w:rFonts w:eastAsia="Arial" w:cs="Arial" w:ascii="Arial" w:hAnsi="Arial"/>
-                <w:sz w:val="18"/>
-                <w:szCs w:val="18"/>
+            <w:tcW w:w="4439" w:type="dxa"/>
+            <w:tcBorders>
+              <w:bottom w:val="single" w:sz="4" w:space="0" w:color="000000"/>
+              <w:right w:val="single" w:sz="4" w:space="0" w:color="000000"/>
+            </w:tcBorders>
+            <w:vAlign w:val="center"/>
+          </w:tcPr>
+          <w:p>
+            <w:pPr>
+              <w:pStyle w:val="normal1"/>
+              <w:rPr>
+                <w:sz w:val="20"/>
+                <w:szCs w:val="20"/>
+              </w:rPr>
+            </w:pPr>
+            <w:r>
+              <w:rPr>
+                <w:rFonts w:eastAsia="Arial" w:cs="Arial" w:ascii="Arial" w:hAnsi="Arial"/>
+                <w:sz w:val="20"/>
+                <w:szCs w:val="20"/>
               </w:rPr>
               <w:t>AAMFH8677A</w:t>
             </w:r>
@@ -440,7 +429,7 @@
         </w:trPr>
         <w:tc>
           <w:tcPr>
-            <w:tcW w:w="518" w:type="dxa"/>
+            <w:tcW w:w="517" w:type="dxa"/>
             <w:tcBorders>
               <w:left w:val="single" w:sz="4" w:space="0" w:color="000000"/>
               <w:bottom w:val="single" w:sz="4" w:space="0" w:color="000000"/>
@@ -454,15 +443,15 @@
               <w:jc w:val="center"/>
               <w:rPr>
                 <w:rFonts w:ascii="Arial" w:hAnsi="Arial" w:eastAsia="Arial" w:cs="Arial"/>
-                <w:sz w:val="18"/>
-                <w:szCs w:val="18"/>
-              </w:rPr>
-            </w:pPr>
-            <w:r>
-              <w:rPr>
-                <w:rFonts w:eastAsia="Arial" w:cs="Arial" w:ascii="Arial" w:hAnsi="Arial"/>
-                <w:sz w:val="18"/>
-                <w:szCs w:val="18"/>
+                <w:sz w:val="20"/>
+                <w:szCs w:val="20"/>
+              </w:rPr>
+            </w:pPr>
+            <w:r>
+              <w:rPr>
+                <w:rFonts w:eastAsia="Arial" w:cs="Arial" w:ascii="Arial" w:hAnsi="Arial"/>
+                <w:sz w:val="20"/>
+                <w:szCs w:val="20"/>
               </w:rPr>
             </w:r>
           </w:p>
@@ -480,16 +469,15 @@
             <w:pPr>
               <w:pStyle w:val="normal1"/>
               <w:rPr>
-                <w:rFonts w:ascii="Arial" w:hAnsi="Arial"/>
-                <w:sz w:val="18"/>
-                <w:szCs w:val="18"/>
-              </w:rPr>
-            </w:pPr>
-            <w:r>
-              <w:rPr>
-                <w:rFonts w:eastAsia="Arial" w:cs="Arial" w:ascii="Arial" w:hAnsi="Arial"/>
-                <w:sz w:val="18"/>
-                <w:szCs w:val="18"/>
+                <w:sz w:val="20"/>
+                <w:szCs w:val="20"/>
+              </w:rPr>
+            </w:pPr>
+            <w:r>
+              <w:rPr>
+                <w:rFonts w:eastAsia="Arial" w:cs="Arial" w:ascii="Arial" w:hAnsi="Arial"/>
+                <w:sz w:val="20"/>
+                <w:szCs w:val="20"/>
               </w:rPr>
               <w:t>b) Branch Code</w:t>
             </w:r>
@@ -497,7 +485,7 @@
         </w:tc>
         <w:tc>
           <w:tcPr>
-            <w:tcW w:w="4438" w:type="dxa"/>
+            <w:tcW w:w="4439" w:type="dxa"/>
             <w:tcBorders>
               <w:bottom w:val="single" w:sz="4" w:space="0" w:color="000000"/>
               <w:right w:val="single" w:sz="4" w:space="0" w:color="000000"/>
@@ -509,15 +497,15 @@
               <w:pStyle w:val="normal1"/>
               <w:rPr>
                 <w:rFonts w:ascii="Arial" w:hAnsi="Arial" w:eastAsia="Arial" w:cs="Arial"/>
-                <w:sz w:val="18"/>
-                <w:szCs w:val="18"/>
-              </w:rPr>
-            </w:pPr>
-            <w:r>
-              <w:rPr>
-                <w:rFonts w:eastAsia="Arial" w:cs="Arial" w:ascii="Arial" w:hAnsi="Arial"/>
-                <w:sz w:val="18"/>
-                <w:szCs w:val="18"/>
+                <w:sz w:val="20"/>
+                <w:szCs w:val="20"/>
+              </w:rPr>
+            </w:pPr>
+            <w:r>
+              <w:rPr>
+                <w:rFonts w:eastAsia="Arial" w:cs="Arial" w:ascii="Arial" w:hAnsi="Arial"/>
+                <w:sz w:val="20"/>
+                <w:szCs w:val="20"/>
               </w:rPr>
             </w:r>
           </w:p>
@@ -529,7 +517,7 @@
         </w:trPr>
         <w:tc>
           <w:tcPr>
-            <w:tcW w:w="518" w:type="dxa"/>
+            <w:tcW w:w="517" w:type="dxa"/>
             <w:tcBorders>
               <w:left w:val="single" w:sz="4" w:space="0" w:color="000000"/>
               <w:bottom w:val="single" w:sz="4" w:space="0" w:color="000000"/>
@@ -543,15 +531,15 @@
               <w:jc w:val="center"/>
               <w:rPr>
                 <w:rFonts w:ascii="Arial" w:hAnsi="Arial" w:eastAsia="Arial" w:cs="Arial"/>
-                <w:sz w:val="18"/>
-                <w:szCs w:val="18"/>
-              </w:rPr>
-            </w:pPr>
-            <w:r>
-              <w:rPr>
-                <w:rFonts w:eastAsia="Arial" w:cs="Arial" w:ascii="Arial" w:hAnsi="Arial"/>
-                <w:sz w:val="18"/>
-                <w:szCs w:val="18"/>
+                <w:sz w:val="20"/>
+                <w:szCs w:val="20"/>
+              </w:rPr>
+            </w:pPr>
+            <w:r>
+              <w:rPr>
+                <w:rFonts w:eastAsia="Arial" w:cs="Arial" w:ascii="Arial" w:hAnsi="Arial"/>
+                <w:sz w:val="20"/>
+                <w:szCs w:val="20"/>
               </w:rPr>
             </w:r>
           </w:p>
@@ -569,16 +557,15 @@
             <w:pPr>
               <w:pStyle w:val="normal1"/>
               <w:rPr>
-                <w:rFonts w:ascii="Arial" w:hAnsi="Arial"/>
-                <w:sz w:val="18"/>
-                <w:szCs w:val="18"/>
-              </w:rPr>
-            </w:pPr>
-            <w:r>
-              <w:rPr>
-                <w:rFonts w:eastAsia="Arial" w:cs="Arial" w:ascii="Arial" w:hAnsi="Arial"/>
-                <w:sz w:val="18"/>
-                <w:szCs w:val="18"/>
+                <w:sz w:val="20"/>
+                <w:szCs w:val="20"/>
+              </w:rPr>
+            </w:pPr>
+            <w:r>
+              <w:rPr>
+                <w:rFonts w:eastAsia="Arial" w:cs="Arial" w:ascii="Arial" w:hAnsi="Arial"/>
+                <w:sz w:val="20"/>
+                <w:szCs w:val="20"/>
               </w:rPr>
               <w:t>c) BIN (PAN based Business) identification Number of the exporter</w:t>
             </w:r>
@@ -586,7 +573,7 @@
         </w:tc>
         <w:tc>
           <w:tcPr>
-            <w:tcW w:w="4438" w:type="dxa"/>
+            <w:tcW w:w="4439" w:type="dxa"/>
             <w:tcBorders>
               <w:bottom w:val="single" w:sz="4" w:space="0" w:color="000000"/>
               <w:right w:val="single" w:sz="4" w:space="0" w:color="000000"/>
@@ -598,15 +585,15 @@
               <w:pStyle w:val="normal1"/>
               <w:rPr>
                 <w:rFonts w:ascii="Arial" w:hAnsi="Arial" w:eastAsia="Arial" w:cs="Arial"/>
-                <w:sz w:val="18"/>
-                <w:szCs w:val="18"/>
-              </w:rPr>
-            </w:pPr>
-            <w:r>
-              <w:rPr>
-                <w:rFonts w:eastAsia="Arial" w:cs="Arial" w:ascii="Arial" w:hAnsi="Arial"/>
-                <w:sz w:val="18"/>
-                <w:szCs w:val="18"/>
+                <w:sz w:val="20"/>
+                <w:szCs w:val="20"/>
+              </w:rPr>
+            </w:pPr>
+            <w:r>
+              <w:rPr>
+                <w:rFonts w:eastAsia="Arial" w:cs="Arial" w:ascii="Arial" w:hAnsi="Arial"/>
+                <w:sz w:val="20"/>
+                <w:szCs w:val="20"/>
               </w:rPr>
             </w:r>
           </w:p>
@@ -618,7 +605,7 @@
         </w:trPr>
         <w:tc>
           <w:tcPr>
-            <w:tcW w:w="518" w:type="dxa"/>
+            <w:tcW w:w="517" w:type="dxa"/>
             <w:tcBorders>
               <w:left w:val="single" w:sz="4" w:space="0" w:color="000000"/>
               <w:bottom w:val="single" w:sz="4" w:space="0" w:color="000000"/>
@@ -632,15 +619,15 @@
               <w:jc w:val="center"/>
               <w:rPr>
                 <w:rFonts w:ascii="Arial" w:hAnsi="Arial" w:eastAsia="Arial" w:cs="Arial"/>
-                <w:sz w:val="18"/>
-                <w:szCs w:val="18"/>
-              </w:rPr>
-            </w:pPr>
-            <w:r>
-              <w:rPr>
-                <w:rFonts w:eastAsia="Arial" w:cs="Arial" w:ascii="Arial" w:hAnsi="Arial"/>
-                <w:sz w:val="18"/>
-                <w:szCs w:val="18"/>
+                <w:sz w:val="20"/>
+                <w:szCs w:val="20"/>
+              </w:rPr>
+            </w:pPr>
+            <w:r>
+              <w:rPr>
+                <w:rFonts w:eastAsia="Arial" w:cs="Arial" w:ascii="Arial" w:hAnsi="Arial"/>
+                <w:sz w:val="20"/>
+                <w:szCs w:val="20"/>
               </w:rPr>
             </w:r>
           </w:p>
@@ -658,16 +645,15 @@
             <w:pPr>
               <w:pStyle w:val="normal1"/>
               <w:rPr>
-                <w:rFonts w:ascii="Arial" w:hAnsi="Arial"/>
-                <w:sz w:val="18"/>
-                <w:szCs w:val="18"/>
-              </w:rPr>
-            </w:pPr>
-            <w:r>
-              <w:rPr>
-                <w:rFonts w:eastAsia="Arial" w:cs="Arial" w:ascii="Arial" w:hAnsi="Arial"/>
-                <w:sz w:val="18"/>
-                <w:szCs w:val="18"/>
+                <w:sz w:val="20"/>
+                <w:szCs w:val="20"/>
+              </w:rPr>
+            </w:pPr>
+            <w:r>
+              <w:rPr>
+                <w:rFonts w:eastAsia="Arial" w:cs="Arial" w:ascii="Arial" w:hAnsi="Arial"/>
+                <w:sz w:val="20"/>
+                <w:szCs w:val="20"/>
               </w:rPr>
               <w:t>d) GST No.</w:t>
             </w:r>
@@ -675,27 +661,26 @@
         </w:tc>
         <w:tc>
           <w:tcPr>
-            <w:tcW w:w="4438" w:type="dxa"/>
-            <w:tcBorders>
-              <w:bottom w:val="single" w:sz="4" w:space="0" w:color="000000"/>
-              <w:right w:val="single" w:sz="4" w:space="0" w:color="000000"/>
-            </w:tcBorders>
-            <w:vAlign w:val="center"/>
-          </w:tcPr>
-          <w:p>
-            <w:pPr>
-              <w:pStyle w:val="normal1"/>
-              <w:rPr>
-                <w:rFonts w:ascii="Arial" w:hAnsi="Arial"/>
-                <w:sz w:val="18"/>
-                <w:szCs w:val="18"/>
-              </w:rPr>
-            </w:pPr>
-            <w:r>
-              <w:rPr>
-                <w:rFonts w:eastAsia="Arial" w:cs="Arial" w:ascii="Arial" w:hAnsi="Arial"/>
-                <w:sz w:val="18"/>
-                <w:szCs w:val="18"/>
+            <w:tcW w:w="4439" w:type="dxa"/>
+            <w:tcBorders>
+              <w:bottom w:val="single" w:sz="4" w:space="0" w:color="000000"/>
+              <w:right w:val="single" w:sz="4" w:space="0" w:color="000000"/>
+            </w:tcBorders>
+            <w:vAlign w:val="center"/>
+          </w:tcPr>
+          <w:p>
+            <w:pPr>
+              <w:pStyle w:val="normal1"/>
+              <w:rPr>
+                <w:sz w:val="20"/>
+                <w:szCs w:val="20"/>
+              </w:rPr>
+            </w:pPr>
+            <w:r>
+              <w:rPr>
+                <w:rFonts w:eastAsia="Arial" w:cs="Arial" w:ascii="Arial" w:hAnsi="Arial"/>
+                <w:sz w:val="20"/>
+                <w:szCs w:val="20"/>
               </w:rPr>
               <w:t>24AAMFH8677A1Z8</w:t>
             </w:r>
@@ -708,7 +693,7 @@
         </w:trPr>
         <w:tc>
           <w:tcPr>
-            <w:tcW w:w="518" w:type="dxa"/>
+            <w:tcW w:w="517" w:type="dxa"/>
             <w:tcBorders>
               <w:left w:val="single" w:sz="4" w:space="0" w:color="000000"/>
               <w:bottom w:val="single" w:sz="4" w:space="0" w:color="000000"/>
@@ -721,16 +706,15 @@
               <w:pStyle w:val="normal1"/>
               <w:jc w:val="center"/>
               <w:rPr>
-                <w:rFonts w:ascii="Arial" w:hAnsi="Arial"/>
-                <w:sz w:val="18"/>
-                <w:szCs w:val="18"/>
-              </w:rPr>
-            </w:pPr>
-            <w:r>
-              <w:rPr>
-                <w:rFonts w:eastAsia="Arial" w:cs="Arial" w:ascii="Arial" w:hAnsi="Arial"/>
-                <w:sz w:val="18"/>
-                <w:szCs w:val="18"/>
+                <w:sz w:val="20"/>
+                <w:szCs w:val="20"/>
+              </w:rPr>
+            </w:pPr>
+            <w:r>
+              <w:rPr>
+                <w:rFonts w:eastAsia="Arial" w:cs="Arial" w:ascii="Arial" w:hAnsi="Arial"/>
+                <w:sz w:val="20"/>
+                <w:szCs w:val="20"/>
               </w:rPr>
               <w:t>3</w:t>
             </w:r>
@@ -749,16 +733,15 @@
             <w:pPr>
               <w:pStyle w:val="normal1"/>
               <w:rPr>
-                <w:rFonts w:ascii="Arial" w:hAnsi="Arial"/>
-                <w:sz w:val="18"/>
-                <w:szCs w:val="18"/>
-              </w:rPr>
-            </w:pPr>
-            <w:r>
-              <w:rPr>
-                <w:rFonts w:eastAsia="Arial" w:cs="Arial" w:ascii="Arial" w:hAnsi="Arial"/>
-                <w:sz w:val="18"/>
-                <w:szCs w:val="18"/>
+                <w:sz w:val="20"/>
+                <w:szCs w:val="20"/>
+              </w:rPr>
+            </w:pPr>
+            <w:r>
+              <w:rPr>
+                <w:rFonts w:eastAsia="Arial" w:cs="Arial" w:ascii="Arial" w:hAnsi="Arial"/>
+                <w:sz w:val="20"/>
+                <w:szCs w:val="20"/>
               </w:rPr>
               <w:t>Name of the Manu, if differ. From the export):</w:t>
             </w:r>
@@ -766,7 +749,7 @@
         </w:tc>
         <w:tc>
           <w:tcPr>
-            <w:tcW w:w="4438" w:type="dxa"/>
+            <w:tcW w:w="4439" w:type="dxa"/>
             <w:tcBorders>
               <w:bottom w:val="single" w:sz="4" w:space="0" w:color="000000"/>
               <w:right w:val="single" w:sz="4" w:space="0" w:color="000000"/>
@@ -778,15 +761,15 @@
               <w:pStyle w:val="normal1"/>
               <w:rPr>
                 <w:rFonts w:ascii="Arial" w:hAnsi="Arial" w:eastAsia="Arial" w:cs="Arial"/>
-                <w:sz w:val="18"/>
-                <w:szCs w:val="18"/>
-              </w:rPr>
-            </w:pPr>
-            <w:r>
-              <w:rPr>
-                <w:rFonts w:eastAsia="Arial" w:cs="Arial" w:ascii="Arial" w:hAnsi="Arial"/>
-                <w:sz w:val="18"/>
-                <w:szCs w:val="18"/>
+                <w:sz w:val="20"/>
+                <w:szCs w:val="20"/>
+              </w:rPr>
+            </w:pPr>
+            <w:r>
+              <w:rPr>
+                <w:rFonts w:eastAsia="Arial" w:cs="Arial" w:ascii="Arial" w:hAnsi="Arial"/>
+                <w:sz w:val="20"/>
+                <w:szCs w:val="20"/>
               </w:rPr>
             </w:r>
           </w:p>
@@ -798,7 +781,7 @@
         </w:trPr>
         <w:tc>
           <w:tcPr>
-            <w:tcW w:w="518" w:type="dxa"/>
+            <w:tcW w:w="517" w:type="dxa"/>
             <w:tcBorders>
               <w:left w:val="single" w:sz="4" w:space="0" w:color="000000"/>
               <w:bottom w:val="single" w:sz="4" w:space="0" w:color="000000"/>
@@ -811,90 +794,86 @@
               <w:pStyle w:val="normal1"/>
               <w:jc w:val="center"/>
               <w:rPr>
+                <w:sz w:val="20"/>
+                <w:szCs w:val="20"/>
+              </w:rPr>
+            </w:pPr>
+            <w:r>
+              <w:rPr>
+                <w:rFonts w:eastAsia="Arial" w:cs="Arial" w:ascii="Arial" w:hAnsi="Arial"/>
+                <w:sz w:val="20"/>
+                <w:szCs w:val="20"/>
+              </w:rPr>
+              <w:t>4</w:t>
+            </w:r>
+          </w:p>
+        </w:tc>
+        <w:tc>
+          <w:tcPr>
+            <w:tcW w:w="4905" w:type="dxa"/>
+            <w:tcBorders>
+              <w:bottom w:val="single" w:sz="4" w:space="0" w:color="000000"/>
+              <w:right w:val="single" w:sz="4" w:space="0" w:color="000000"/>
+            </w:tcBorders>
+            <w:vAlign w:val="center"/>
+          </w:tcPr>
+          <w:p>
+            <w:pPr>
+              <w:pStyle w:val="normal1"/>
+              <w:rPr>
+                <w:sz w:val="20"/>
+                <w:szCs w:val="20"/>
+              </w:rPr>
+            </w:pPr>
+            <w:r>
+              <w:rPr>
+                <w:rFonts w:eastAsia="Arial" w:cs="Arial" w:ascii="Arial" w:hAnsi="Arial"/>
+                <w:sz w:val="20"/>
+                <w:szCs w:val="20"/>
+              </w:rPr>
+              <w:t>Name of mfg. and Factory Address.</w:t>
+            </w:r>
+          </w:p>
+        </w:tc>
+        <w:tc>
+          <w:tcPr>
+            <w:tcW w:w="4439" w:type="dxa"/>
+            <w:tcBorders>
+              <w:bottom w:val="single" w:sz="4" w:space="0" w:color="000000"/>
+              <w:right w:val="single" w:sz="4" w:space="0" w:color="000000"/>
+            </w:tcBorders>
+            <w:vAlign w:val="center"/>
+          </w:tcPr>
+          <w:p>
+            <w:pPr>
+              <w:pStyle w:val="normal1"/>
+              <w:rPr>
+                <w:sz w:val="20"/>
+                <w:szCs w:val="20"/>
+              </w:rPr>
+            </w:pPr>
+            <w:r>
+              <w:rPr>
+                <w:rFonts w:eastAsia="Arial" w:cs="Arial" w:ascii="Arial" w:hAnsi="Arial"/>
+                <w:sz w:val="20"/>
+                <w:szCs w:val="20"/>
+              </w:rPr>
+              <w:t>HORIZON ENTERPRISE</w:t>
+            </w:r>
+          </w:p>
+          <w:p>
+            <w:pPr>
+              <w:pStyle w:val="normal1"/>
+              <w:rPr>
+                <w:sz w:val="20"/>
+                <w:szCs w:val="20"/>
+              </w:rPr>
+            </w:pPr>
+            <w:r>
+              <w:rPr>
                 <w:rFonts w:ascii="Arial" w:hAnsi="Arial"/>
-                <w:sz w:val="18"/>
-                <w:szCs w:val="18"/>
-              </w:rPr>
-            </w:pPr>
-            <w:r>
-              <w:rPr>
-                <w:rFonts w:eastAsia="Arial" w:cs="Arial" w:ascii="Arial" w:hAnsi="Arial"/>
-                <w:sz w:val="18"/>
-                <w:szCs w:val="18"/>
-              </w:rPr>
-              <w:t>4</w:t>
-            </w:r>
-          </w:p>
-        </w:tc>
-        <w:tc>
-          <w:tcPr>
-            <w:tcW w:w="4905" w:type="dxa"/>
-            <w:tcBorders>
-              <w:bottom w:val="single" w:sz="4" w:space="0" w:color="000000"/>
-              <w:right w:val="single" w:sz="4" w:space="0" w:color="000000"/>
-            </w:tcBorders>
-            <w:vAlign w:val="center"/>
-          </w:tcPr>
-          <w:p>
-            <w:pPr>
-              <w:pStyle w:val="normal1"/>
-              <w:rPr>
-                <w:rFonts w:ascii="Arial" w:hAnsi="Arial"/>
-                <w:sz w:val="18"/>
-                <w:szCs w:val="18"/>
-              </w:rPr>
-            </w:pPr>
-            <w:r>
-              <w:rPr>
-                <w:rFonts w:eastAsia="Arial" w:cs="Arial" w:ascii="Arial" w:hAnsi="Arial"/>
-                <w:sz w:val="18"/>
-                <w:szCs w:val="18"/>
-              </w:rPr>
-              <w:t>Name of mfg. and Factory Address.</w:t>
-            </w:r>
-          </w:p>
-        </w:tc>
-        <w:tc>
-          <w:tcPr>
-            <w:tcW w:w="4438" w:type="dxa"/>
-            <w:tcBorders>
-              <w:bottom w:val="single" w:sz="4" w:space="0" w:color="000000"/>
-              <w:right w:val="single" w:sz="4" w:space="0" w:color="000000"/>
-            </w:tcBorders>
-            <w:vAlign w:val="center"/>
-          </w:tcPr>
-          <w:p>
-            <w:pPr>
-              <w:pStyle w:val="normal1"/>
-              <w:rPr>
-                <w:rFonts w:ascii="Arial" w:hAnsi="Arial"/>
-                <w:sz w:val="18"/>
-                <w:szCs w:val="18"/>
-              </w:rPr>
-            </w:pPr>
-            <w:r>
-              <w:rPr>
-                <w:rFonts w:eastAsia="Arial" w:cs="Arial" w:ascii="Arial" w:hAnsi="Arial"/>
-                <w:sz w:val="18"/>
-                <w:szCs w:val="18"/>
-              </w:rPr>
-              <w:t>HORIZON ENTERPRISE</w:t>
-            </w:r>
-          </w:p>
-          <w:p>
-            <w:pPr>
-              <w:pStyle w:val="normal1"/>
-              <w:rPr>
-                <w:rFonts w:ascii="Arial" w:hAnsi="Arial"/>
-                <w:sz w:val="18"/>
-                <w:szCs w:val="18"/>
-              </w:rPr>
-            </w:pPr>
-            <w:r>
-              <w:rPr>
-                <w:rFonts w:ascii="Arial" w:hAnsi="Arial"/>
-                <w:sz w:val="18"/>
-                <w:szCs w:val="18"/>
+                <w:sz w:val="20"/>
+                <w:szCs w:val="20"/>
               </w:rPr>
               <w:t>E 802, SAFAL PARISAR-1 SOUTH BOPAL, AHMEDABAD, GUJARAT- 380058 INDIA</w:t>
             </w:r>
@@ -907,7 +886,7 @@
         </w:trPr>
         <w:tc>
           <w:tcPr>
-            <w:tcW w:w="518" w:type="dxa"/>
+            <w:tcW w:w="517" w:type="dxa"/>
             <w:tcBorders>
               <w:left w:val="single" w:sz="4" w:space="0" w:color="000000"/>
               <w:bottom w:val="single" w:sz="4" w:space="0" w:color="000000"/>
@@ -920,16 +899,15 @@
               <w:pStyle w:val="normal1"/>
               <w:jc w:val="center"/>
               <w:rPr>
-                <w:rFonts w:ascii="Arial" w:hAnsi="Arial"/>
-                <w:sz w:val="18"/>
-                <w:szCs w:val="18"/>
-              </w:rPr>
-            </w:pPr>
-            <w:r>
-              <w:rPr>
-                <w:rFonts w:eastAsia="Arial" w:cs="Arial" w:ascii="Arial" w:hAnsi="Arial"/>
-                <w:sz w:val="18"/>
-                <w:szCs w:val="18"/>
+                <w:sz w:val="20"/>
+                <w:szCs w:val="20"/>
+              </w:rPr>
+            </w:pPr>
+            <w:r>
+              <w:rPr>
+                <w:rFonts w:eastAsia="Arial" w:cs="Arial" w:ascii="Arial" w:hAnsi="Arial"/>
+                <w:sz w:val="20"/>
+                <w:szCs w:val="20"/>
               </w:rPr>
               <w:t>5</w:t>
             </w:r>
@@ -948,16 +926,15 @@
             <w:pPr>
               <w:pStyle w:val="normal1"/>
               <w:rPr>
-                <w:rFonts w:ascii="Arial" w:hAnsi="Arial"/>
-                <w:sz w:val="18"/>
-                <w:szCs w:val="18"/>
-              </w:rPr>
-            </w:pPr>
-            <w:r>
-              <w:rPr>
-                <w:rFonts w:eastAsia="Arial" w:cs="Arial" w:ascii="Arial" w:hAnsi="Arial"/>
-                <w:sz w:val="18"/>
-                <w:szCs w:val="18"/>
+                <w:sz w:val="20"/>
+                <w:szCs w:val="20"/>
+              </w:rPr>
+            </w:pPr>
+            <w:r>
+              <w:rPr>
+                <w:rFonts w:eastAsia="Arial" w:cs="Arial" w:ascii="Arial" w:hAnsi="Arial"/>
+                <w:sz w:val="20"/>
+                <w:szCs w:val="20"/>
               </w:rPr>
               <w:t>ISO 9001:2015 CERTIFICATE No.</w:t>
             </w:r>
@@ -965,7 +942,7 @@
         </w:tc>
         <w:tc>
           <w:tcPr>
-            <w:tcW w:w="4438" w:type="dxa"/>
+            <w:tcW w:w="4439" w:type="dxa"/>
             <w:tcBorders>
               <w:bottom w:val="single" w:sz="4" w:space="0" w:color="000000"/>
               <w:right w:val="single" w:sz="4" w:space="0" w:color="000000"/>
@@ -977,15 +954,15 @@
               <w:pStyle w:val="normal1"/>
               <w:rPr>
                 <w:rFonts w:ascii="Arial" w:hAnsi="Arial" w:eastAsia="Arial" w:cs="Arial"/>
-                <w:sz w:val="18"/>
-                <w:szCs w:val="18"/>
-              </w:rPr>
-            </w:pPr>
-            <w:r>
-              <w:rPr>
-                <w:rFonts w:eastAsia="Arial" w:cs="Arial" w:ascii="Arial" w:hAnsi="Arial"/>
-                <w:sz w:val="18"/>
-                <w:szCs w:val="18"/>
+                <w:sz w:val="20"/>
+                <w:szCs w:val="20"/>
+              </w:rPr>
+            </w:pPr>
+            <w:r>
+              <w:rPr>
+                <w:rFonts w:eastAsia="Arial" w:cs="Arial" w:ascii="Arial" w:hAnsi="Arial"/>
+                <w:sz w:val="20"/>
+                <w:szCs w:val="20"/>
               </w:rPr>
             </w:r>
           </w:p>
@@ -997,7 +974,7 @@
         </w:trPr>
         <w:tc>
           <w:tcPr>
-            <w:tcW w:w="518" w:type="dxa"/>
+            <w:tcW w:w="517" w:type="dxa"/>
             <w:tcBorders>
               <w:left w:val="single" w:sz="4" w:space="0" w:color="000000"/>
               <w:bottom w:val="single" w:sz="4" w:space="0" w:color="000000"/>
@@ -1010,16 +987,15 @@
               <w:pStyle w:val="normal1"/>
               <w:jc w:val="center"/>
               <w:rPr>
-                <w:rFonts w:ascii="Arial" w:hAnsi="Arial"/>
-                <w:sz w:val="18"/>
-                <w:szCs w:val="18"/>
-              </w:rPr>
-            </w:pPr>
-            <w:r>
-              <w:rPr>
-                <w:rFonts w:eastAsia="Arial" w:cs="Arial" w:ascii="Arial" w:hAnsi="Arial"/>
-                <w:sz w:val="18"/>
-                <w:szCs w:val="18"/>
+                <w:sz w:val="20"/>
+                <w:szCs w:val="20"/>
+              </w:rPr>
+            </w:pPr>
+            <w:r>
+              <w:rPr>
+                <w:rFonts w:eastAsia="Arial" w:cs="Arial" w:ascii="Arial" w:hAnsi="Arial"/>
+                <w:sz w:val="20"/>
+                <w:szCs w:val="20"/>
               </w:rPr>
               <w:t>6</w:t>
             </w:r>
@@ -1038,16 +1014,15 @@
             <w:pPr>
               <w:pStyle w:val="normal1"/>
               <w:rPr>
-                <w:rFonts w:ascii="Arial" w:hAnsi="Arial"/>
-                <w:sz w:val="18"/>
-                <w:szCs w:val="18"/>
-              </w:rPr>
-            </w:pPr>
-            <w:r>
-              <w:rPr>
-                <w:rFonts w:eastAsia="Arial" w:cs="Arial" w:ascii="Arial" w:hAnsi="Arial"/>
-                <w:sz w:val="18"/>
-                <w:szCs w:val="18"/>
+                <w:sz w:val="20"/>
+                <w:szCs w:val="20"/>
+              </w:rPr>
+            </w:pPr>
+            <w:r>
+              <w:rPr>
+                <w:rFonts w:eastAsia="Arial" w:cs="Arial" w:ascii="Arial" w:hAnsi="Arial"/>
+                <w:sz w:val="20"/>
+                <w:szCs w:val="20"/>
               </w:rPr>
               <w:t>Date of Examination</w:t>
             </w:r>
@@ -1055,7 +1030,7 @@
         </w:tc>
         <w:tc>
           <w:tcPr>
-            <w:tcW w:w="4438" w:type="dxa"/>
+            <w:tcW w:w="4439" w:type="dxa"/>
             <w:tcBorders>
               <w:bottom w:val="single" w:sz="4" w:space="0" w:color="000000"/>
               <w:right w:val="single" w:sz="4" w:space="0" w:color="000000"/>
@@ -1067,15 +1042,15 @@
               <w:pStyle w:val="normal1"/>
               <w:rPr>
                 <w:rFonts w:ascii="Arial" w:hAnsi="Arial" w:eastAsia="Arial" w:cs="Arial"/>
-                <w:sz w:val="18"/>
-                <w:szCs w:val="18"/>
-              </w:rPr>
-            </w:pPr>
-            <w:r>
-              <w:rPr>
-                <w:rFonts w:eastAsia="Arial" w:cs="Arial" w:ascii="Arial" w:hAnsi="Arial"/>
-                <w:sz w:val="18"/>
-                <w:szCs w:val="18"/>
+                <w:sz w:val="20"/>
+                <w:szCs w:val="20"/>
+              </w:rPr>
+            </w:pPr>
+            <w:r>
+              <w:rPr>
+                <w:rFonts w:eastAsia="Arial" w:cs="Arial" w:ascii="Arial" w:hAnsi="Arial"/>
+                <w:sz w:val="20"/>
+                <w:szCs w:val="20"/>
               </w:rPr>
             </w:r>
           </w:p>
@@ -1087,7 +1062,7 @@
         </w:trPr>
         <w:tc>
           <w:tcPr>
-            <w:tcW w:w="518" w:type="dxa"/>
+            <w:tcW w:w="517" w:type="dxa"/>
             <w:tcBorders>
               <w:left w:val="single" w:sz="4" w:space="0" w:color="000000"/>
               <w:bottom w:val="single" w:sz="4" w:space="0" w:color="000000"/>
@@ -1100,16 +1075,15 @@
               <w:pStyle w:val="normal1"/>
               <w:jc w:val="center"/>
               <w:rPr>
-                <w:rFonts w:ascii="Arial" w:hAnsi="Arial"/>
-                <w:sz w:val="18"/>
-                <w:szCs w:val="18"/>
-              </w:rPr>
-            </w:pPr>
-            <w:r>
-              <w:rPr>
-                <w:rFonts w:eastAsia="Arial" w:cs="Arial" w:ascii="Arial" w:hAnsi="Arial"/>
-                <w:sz w:val="18"/>
-                <w:szCs w:val="18"/>
+                <w:sz w:val="20"/>
+                <w:szCs w:val="20"/>
+              </w:rPr>
+            </w:pPr>
+            <w:r>
+              <w:rPr>
+                <w:rFonts w:eastAsia="Arial" w:cs="Arial" w:ascii="Arial" w:hAnsi="Arial"/>
+                <w:sz w:val="20"/>
+                <w:szCs w:val="20"/>
               </w:rPr>
               <w:t>7</w:t>
             </w:r>
@@ -1128,16 +1102,15 @@
             <w:pPr>
               <w:pStyle w:val="normal1"/>
               <w:rPr>
-                <w:rFonts w:ascii="Arial" w:hAnsi="Arial"/>
-                <w:sz w:val="18"/>
-                <w:szCs w:val="18"/>
-              </w:rPr>
-            </w:pPr>
-            <w:r>
-              <w:rPr>
-                <w:rFonts w:eastAsia="Arial" w:cs="Arial" w:ascii="Arial" w:hAnsi="Arial"/>
-                <w:sz w:val="18"/>
-                <w:szCs w:val="18"/>
+                <w:sz w:val="20"/>
+                <w:szCs w:val="20"/>
+              </w:rPr>
+            </w:pPr>
+            <w:r>
+              <w:rPr>
+                <w:rFonts w:eastAsia="Arial" w:cs="Arial" w:ascii="Arial" w:hAnsi="Arial"/>
+                <w:sz w:val="20"/>
+                <w:szCs w:val="20"/>
               </w:rPr>
               <w:t>Name &amp; designation of the Authorized Signatory</w:t>
             </w:r>
@@ -1145,27 +1118,26 @@
         </w:tc>
         <w:tc>
           <w:tcPr>
-            <w:tcW w:w="4438" w:type="dxa"/>
-            <w:tcBorders>
-              <w:bottom w:val="single" w:sz="4" w:space="0" w:color="000000"/>
-              <w:right w:val="single" w:sz="4" w:space="0" w:color="000000"/>
-            </w:tcBorders>
-            <w:vAlign w:val="center"/>
-          </w:tcPr>
-          <w:p>
-            <w:pPr>
-              <w:pStyle w:val="normal1"/>
-              <w:rPr>
-                <w:rFonts w:ascii="Arial" w:hAnsi="Arial"/>
-                <w:sz w:val="18"/>
-                <w:szCs w:val="18"/>
-              </w:rPr>
-            </w:pPr>
-            <w:r>
-              <w:rPr>
-                <w:rFonts w:eastAsia="Arial" w:cs="Arial" w:ascii="Arial" w:hAnsi="Arial"/>
-                <w:sz w:val="18"/>
-                <w:szCs w:val="18"/>
+            <w:tcW w:w="4439" w:type="dxa"/>
+            <w:tcBorders>
+              <w:bottom w:val="single" w:sz="4" w:space="0" w:color="000000"/>
+              <w:right w:val="single" w:sz="4" w:space="0" w:color="000000"/>
+            </w:tcBorders>
+            <w:vAlign w:val="center"/>
+          </w:tcPr>
+          <w:p>
+            <w:pPr>
+              <w:pStyle w:val="normal1"/>
+              <w:rPr>
+                <w:sz w:val="20"/>
+                <w:szCs w:val="20"/>
+              </w:rPr>
+            </w:pPr>
+            <w:r>
+              <w:rPr>
+                <w:rFonts w:eastAsia="Arial" w:cs="Arial" w:ascii="Arial" w:hAnsi="Arial"/>
+                <w:sz w:val="20"/>
+                <w:szCs w:val="20"/>
               </w:rPr>
               <w:t>Mr. Dhaval Ghodasara</w:t>
             </w:r>
@@ -1178,7 +1150,7 @@
         </w:trPr>
         <w:tc>
           <w:tcPr>
-            <w:tcW w:w="518" w:type="dxa"/>
+            <w:tcW w:w="517" w:type="dxa"/>
             <w:tcBorders>
               <w:left w:val="single" w:sz="4" w:space="0" w:color="000000"/>
               <w:bottom w:val="single" w:sz="4" w:space="0" w:color="000000"/>
@@ -1191,91 +1163,87 @@
               <w:pStyle w:val="normal1"/>
               <w:jc w:val="center"/>
               <w:rPr>
+                <w:sz w:val="20"/>
+                <w:szCs w:val="20"/>
+              </w:rPr>
+            </w:pPr>
+            <w:r>
+              <w:rPr>
+                <w:rFonts w:eastAsia="Arial" w:cs="Arial" w:ascii="Arial" w:hAnsi="Arial"/>
+                <w:sz w:val="20"/>
+                <w:szCs w:val="20"/>
+              </w:rPr>
+              <w:t>8</w:t>
+            </w:r>
+          </w:p>
+        </w:tc>
+        <w:tc>
+          <w:tcPr>
+            <w:tcW w:w="4905" w:type="dxa"/>
+            <w:tcBorders>
+              <w:bottom w:val="single" w:sz="4" w:space="0" w:color="000000"/>
+              <w:right w:val="single" w:sz="4" w:space="0" w:color="000000"/>
+            </w:tcBorders>
+            <w:vAlign w:val="center"/>
+          </w:tcPr>
+          <w:p>
+            <w:pPr>
+              <w:pStyle w:val="normal1"/>
+              <w:rPr>
+                <w:sz w:val="20"/>
+                <w:szCs w:val="20"/>
+              </w:rPr>
+            </w:pPr>
+            <w:r>
+              <w:rPr>
+                <w:rFonts w:eastAsia="Arial" w:cs="Arial" w:ascii="Arial" w:hAnsi="Arial"/>
+                <w:sz w:val="20"/>
+                <w:szCs w:val="20"/>
+              </w:rPr>
+              <w:t>a) Name of Commissionerate/ Divn ,/Range/Location Code</w:t>
+            </w:r>
+          </w:p>
+        </w:tc>
+        <w:tc>
+          <w:tcPr>
+            <w:tcW w:w="4439" w:type="dxa"/>
+            <w:tcBorders>
+              <w:left w:val="single" w:sz="4" w:space="0" w:color="000000"/>
+              <w:bottom w:val="single" w:sz="4" w:space="0" w:color="000000"/>
+              <w:right w:val="single" w:sz="4" w:space="0" w:color="000000"/>
+            </w:tcBorders>
+            <w:vAlign w:val="center"/>
+          </w:tcPr>
+          <w:p>
+            <w:pPr>
+              <w:pStyle w:val="normal1"/>
+              <w:rPr>
+                <w:sz w:val="20"/>
+                <w:szCs w:val="20"/>
+              </w:rPr>
+            </w:pPr>
+            <w:r>
+              <w:rPr>
+                <w:rFonts w:eastAsia="Arial" w:cs="Arial" w:ascii="Arial" w:hAnsi="Arial"/>
+                <w:sz w:val="20"/>
+                <w:szCs w:val="20"/>
+              </w:rPr>
+              <w:t>Commissionerate- AHMEDABAD- NORTH,</w:t>
+            </w:r>
+          </w:p>
+          <w:p>
+            <w:pPr>
+              <w:pStyle w:val="normal1"/>
+              <w:rPr>
+                <w:sz w:val="20"/>
+                <w:szCs w:val="20"/>
+              </w:rPr>
+            </w:pPr>
+            <w:r>
+              <w:rPr>
                 <w:rFonts w:ascii="Arial" w:hAnsi="Arial"/>
-                <w:sz w:val="18"/>
-                <w:szCs w:val="18"/>
-              </w:rPr>
-            </w:pPr>
-            <w:r>
-              <w:rPr>
-                <w:rFonts w:eastAsia="Arial" w:cs="Arial" w:ascii="Arial" w:hAnsi="Arial"/>
-                <w:sz w:val="18"/>
-                <w:szCs w:val="18"/>
-              </w:rPr>
-              <w:t>8</w:t>
-            </w:r>
-          </w:p>
-        </w:tc>
-        <w:tc>
-          <w:tcPr>
-            <w:tcW w:w="4905" w:type="dxa"/>
-            <w:tcBorders>
-              <w:bottom w:val="single" w:sz="4" w:space="0" w:color="000000"/>
-              <w:right w:val="single" w:sz="4" w:space="0" w:color="000000"/>
-            </w:tcBorders>
-            <w:vAlign w:val="center"/>
-          </w:tcPr>
-          <w:p>
-            <w:pPr>
-              <w:pStyle w:val="normal1"/>
-              <w:rPr>
-                <w:rFonts w:ascii="Arial" w:hAnsi="Arial"/>
-                <w:sz w:val="18"/>
-                <w:szCs w:val="18"/>
-              </w:rPr>
-            </w:pPr>
-            <w:r>
-              <w:rPr>
-                <w:rFonts w:eastAsia="Arial" w:cs="Arial" w:ascii="Arial" w:hAnsi="Arial"/>
-                <w:sz w:val="18"/>
-                <w:szCs w:val="18"/>
-              </w:rPr>
-              <w:t>a) Name of Commissionerate/ Divn ,/Range/Location Code</w:t>
-            </w:r>
-          </w:p>
-        </w:tc>
-        <w:tc>
-          <w:tcPr>
-            <w:tcW w:w="4438" w:type="dxa"/>
-            <w:tcBorders>
-              <w:left w:val="single" w:sz="4" w:space="0" w:color="000000"/>
-              <w:bottom w:val="single" w:sz="4" w:space="0" w:color="000000"/>
-              <w:right w:val="single" w:sz="4" w:space="0" w:color="000000"/>
-            </w:tcBorders>
-            <w:vAlign w:val="center"/>
-          </w:tcPr>
-          <w:p>
-            <w:pPr>
-              <w:pStyle w:val="normal1"/>
-              <w:rPr>
-                <w:rFonts w:ascii="Arial" w:hAnsi="Arial"/>
-                <w:sz w:val="18"/>
-                <w:szCs w:val="18"/>
-              </w:rPr>
-            </w:pPr>
-            <w:r>
-              <w:rPr>
-                <w:rFonts w:eastAsia="Arial" w:cs="Arial" w:ascii="Arial" w:hAnsi="Arial"/>
-                <w:sz w:val="18"/>
-                <w:szCs w:val="18"/>
-              </w:rPr>
-              <w:t>Commissionerate- AHMEDABAD- NORTH,</w:t>
-            </w:r>
-          </w:p>
-          <w:p>
-            <w:pPr>
-              <w:pStyle w:val="normal1"/>
-              <w:rPr>
-                <w:rFonts w:ascii="Arial" w:hAnsi="Arial"/>
-                <w:sz w:val="18"/>
-                <w:szCs w:val="18"/>
-              </w:rPr>
-            </w:pPr>
-            <w:r>
-              <w:rPr>
-                <w:rFonts w:ascii="Arial" w:hAnsi="Arial"/>
-                <w:sz w:val="18"/>
-                <w:szCs w:val="18"/>
+                <w:sz w:val="20"/>
+                <w:szCs w:val="20"/>
               </w:rPr>
               <w:t>Division- DIVISION- VI- S G HIGHWAY WEST, Range-RANGE I (Jurisdictional Office)</w:t>
             </w:r>
@@ -1288,7 +1256,7 @@
         </w:trPr>
         <w:tc>
           <w:tcPr>
-            <w:tcW w:w="518" w:type="dxa"/>
+            <w:tcW w:w="517" w:type="dxa"/>
             <w:tcBorders>
               <w:left w:val="single" w:sz="4" w:space="0" w:color="000000"/>
               <w:bottom w:val="single" w:sz="4" w:space="0" w:color="000000"/>
@@ -1301,16 +1269,15 @@
               <w:pStyle w:val="normal1"/>
               <w:jc w:val="center"/>
               <w:rPr>
-                <w:rFonts w:ascii="Arial" w:hAnsi="Arial"/>
-                <w:sz w:val="18"/>
-                <w:szCs w:val="18"/>
-              </w:rPr>
-            </w:pPr>
-            <w:r>
-              <w:rPr>
-                <w:rFonts w:eastAsia="Arial" w:cs="Arial" w:ascii="Arial" w:hAnsi="Arial"/>
-                <w:sz w:val="18"/>
-                <w:szCs w:val="18"/>
+                <w:sz w:val="20"/>
+                <w:szCs w:val="20"/>
+              </w:rPr>
+            </w:pPr>
+            <w:r>
+              <w:rPr>
+                <w:rFonts w:eastAsia="Arial" w:cs="Arial" w:ascii="Arial" w:hAnsi="Arial"/>
+                <w:sz w:val="20"/>
+                <w:szCs w:val="20"/>
               </w:rPr>
               <w:t>9</w:t>
             </w:r>
@@ -1329,16 +1296,15 @@
             <w:pPr>
               <w:pStyle w:val="normal1"/>
               <w:rPr>
-                <w:rFonts w:ascii="Arial" w:hAnsi="Arial"/>
-                <w:sz w:val="18"/>
-                <w:szCs w:val="18"/>
-              </w:rPr>
-            </w:pPr>
-            <w:r>
-              <w:rPr>
-                <w:rFonts w:eastAsia="Arial" w:cs="Arial" w:ascii="Arial" w:hAnsi="Arial"/>
-                <w:sz w:val="18"/>
-                <w:szCs w:val="18"/>
+                <w:sz w:val="20"/>
+                <w:szCs w:val="20"/>
+              </w:rPr>
+            </w:pPr>
+            <w:r>
+              <w:rPr>
+                <w:rFonts w:eastAsia="Arial" w:cs="Arial" w:ascii="Arial" w:hAnsi="Arial"/>
+                <w:sz w:val="20"/>
+                <w:szCs w:val="20"/>
               </w:rPr>
               <w:t>Particulars of export Invoice</w:t>
             </w:r>
@@ -1346,7 +1312,7 @@
         </w:tc>
         <w:tc>
           <w:tcPr>
-            <w:tcW w:w="4438" w:type="dxa"/>
+            <w:tcW w:w="4439" w:type="dxa"/>
             <w:tcBorders>
               <w:bottom w:val="single" w:sz="4" w:space="0" w:color="000000"/>
               <w:right w:val="single" w:sz="4" w:space="0" w:color="000000"/>
@@ -1358,15 +1324,15 @@
               <w:pStyle w:val="normal1"/>
               <w:rPr>
                 <w:rFonts w:ascii="Arial" w:hAnsi="Arial" w:eastAsia="Arial" w:cs="Arial"/>
-                <w:sz w:val="18"/>
-                <w:szCs w:val="18"/>
-              </w:rPr>
-            </w:pPr>
-            <w:r>
-              <w:rPr>
-                <w:rFonts w:eastAsia="Arial" w:cs="Arial" w:ascii="Arial" w:hAnsi="Arial"/>
-                <w:sz w:val="18"/>
-                <w:szCs w:val="18"/>
+                <w:sz w:val="20"/>
+                <w:szCs w:val="20"/>
+              </w:rPr>
+            </w:pPr>
+            <w:r>
+              <w:rPr>
+                <w:rFonts w:eastAsia="Arial" w:cs="Arial" w:ascii="Arial" w:hAnsi="Arial"/>
+                <w:sz w:val="20"/>
+                <w:szCs w:val="20"/>
               </w:rPr>
             </w:r>
           </w:p>
@@ -1378,7 +1344,7 @@
         </w:trPr>
         <w:tc>
           <w:tcPr>
-            <w:tcW w:w="518" w:type="dxa"/>
+            <w:tcW w:w="517" w:type="dxa"/>
             <w:tcBorders>
               <w:left w:val="single" w:sz="4" w:space="0" w:color="000000"/>
               <w:bottom w:val="single" w:sz="4" w:space="0" w:color="000000"/>
@@ -1392,15 +1358,15 @@
               <w:jc w:val="center"/>
               <w:rPr>
                 <w:rFonts w:ascii="Arial" w:hAnsi="Arial" w:eastAsia="Arial" w:cs="Arial"/>
-                <w:sz w:val="18"/>
-                <w:szCs w:val="18"/>
-              </w:rPr>
-            </w:pPr>
-            <w:r>
-              <w:rPr>
-                <w:rFonts w:eastAsia="Arial" w:cs="Arial" w:ascii="Arial" w:hAnsi="Arial"/>
-                <w:sz w:val="18"/>
-                <w:szCs w:val="18"/>
+                <w:sz w:val="20"/>
+                <w:szCs w:val="20"/>
+              </w:rPr>
+            </w:pPr>
+            <w:r>
+              <w:rPr>
+                <w:rFonts w:eastAsia="Arial" w:cs="Arial" w:ascii="Arial" w:hAnsi="Arial"/>
+                <w:sz w:val="20"/>
+                <w:szCs w:val="20"/>
               </w:rPr>
             </w:r>
           </w:p>
@@ -1418,16 +1384,15 @@
             <w:pPr>
               <w:pStyle w:val="normal1"/>
               <w:rPr>
-                <w:rFonts w:ascii="Arial" w:hAnsi="Arial"/>
-                <w:sz w:val="18"/>
-                <w:szCs w:val="18"/>
-              </w:rPr>
-            </w:pPr>
-            <w:r>
-              <w:rPr>
-                <w:rFonts w:eastAsia="Arial" w:cs="Arial" w:ascii="Arial" w:hAnsi="Arial"/>
-                <w:sz w:val="18"/>
-                <w:szCs w:val="18"/>
+                <w:sz w:val="20"/>
+                <w:szCs w:val="20"/>
+              </w:rPr>
+            </w:pPr>
+            <w:r>
+              <w:rPr>
+                <w:rFonts w:eastAsia="Arial" w:cs="Arial" w:ascii="Arial" w:hAnsi="Arial"/>
+                <w:sz w:val="20"/>
+                <w:szCs w:val="20"/>
               </w:rPr>
               <w:t>a) Export Invoice No.</w:t>
             </w:r>
@@ -1435,7 +1400,7 @@
         </w:tc>
         <w:tc>
           <w:tcPr>
-            <w:tcW w:w="4438" w:type="dxa"/>
+            <w:tcW w:w="4439" w:type="dxa"/>
             <w:tcBorders>
               <w:bottom w:val="single" w:sz="4" w:space="0" w:color="000000"/>
               <w:right w:val="single" w:sz="4" w:space="0" w:color="000000"/>
@@ -1453,16 +1418,15 @@
               <w:ind w:hanging="0" w:left="0" w:right="504"/>
               <w:jc w:val="left"/>
               <w:rPr>
-                <w:rFonts w:ascii="Arial" w:hAnsi="Arial"/>
-                <w:sz w:val="18"/>
-                <w:szCs w:val="18"/>
-              </w:rPr>
-            </w:pPr>
-            <w:r>
-              <w:rPr>
-                <w:rFonts w:eastAsia="Arial" w:cs="Arial" w:ascii="Arial" w:hAnsi="Arial"/>
-                <w:sz w:val="18"/>
-                <w:szCs w:val="18"/>
+                <w:sz w:val="20"/>
+                <w:szCs w:val="20"/>
+              </w:rPr>
+            </w:pPr>
+            <w:r>
+              <w:rPr>
+                <w:rFonts w:eastAsia="Arial" w:cs="Arial" w:ascii="Arial" w:hAnsi="Arial"/>
+                <w:sz w:val="20"/>
+                <w:szCs w:val="20"/>
               </w:rPr>
               <w:t xml:space="preserve">{{ invoice_no }} </w:t>
             </w:r>
@@ -1479,9 +1443,9 @@
                 <w:dstrike w:val="false"/>
                 <w:color w:val="000000"/>
                 <w:position w:val="0"/>
-                <w:sz w:val="18"/>
-                <w:sz w:val="18"/>
-                <w:szCs w:val="18"/>
+                <w:sz w:val="20"/>
+                <w:sz w:val="20"/>
+                <w:szCs w:val="20"/>
                 <w:u w:val="none"/>
                 <w:shd w:fill="auto" w:val="clear"/>
                 <w:vertAlign w:val="baseline"/>
@@ -1491,8 +1455,8 @@
             <w:r>
               <w:rPr>
                 <w:rFonts w:eastAsia="Arial" w:cs="Arial" w:ascii="Arial" w:hAnsi="Arial"/>
-                <w:sz w:val="18"/>
-                <w:szCs w:val="18"/>
+                <w:sz w:val="20"/>
+                <w:szCs w:val="20"/>
               </w:rPr>
               <w:t>{{ invoice_date }}</w:t>
             </w:r>
@@ -1505,7 +1469,7 @@
         </w:trPr>
         <w:tc>
           <w:tcPr>
-            <w:tcW w:w="518" w:type="dxa"/>
+            <w:tcW w:w="517" w:type="dxa"/>
             <w:tcBorders>
               <w:left w:val="single" w:sz="4" w:space="0" w:color="000000"/>
               <w:bottom w:val="single" w:sz="4" w:space="0" w:color="000000"/>
@@ -1519,15 +1483,15 @@
               <w:jc w:val="center"/>
               <w:rPr>
                 <w:rFonts w:ascii="Arial" w:hAnsi="Arial" w:eastAsia="Arial" w:cs="Arial"/>
-                <w:sz w:val="18"/>
-                <w:szCs w:val="18"/>
-              </w:rPr>
-            </w:pPr>
-            <w:r>
-              <w:rPr>
-                <w:rFonts w:eastAsia="Arial" w:cs="Arial" w:ascii="Arial" w:hAnsi="Arial"/>
-                <w:sz w:val="18"/>
-                <w:szCs w:val="18"/>
+                <w:sz w:val="20"/>
+                <w:szCs w:val="20"/>
+              </w:rPr>
+            </w:pPr>
+            <w:r>
+              <w:rPr>
+                <w:rFonts w:eastAsia="Arial" w:cs="Arial" w:ascii="Arial" w:hAnsi="Arial"/>
+                <w:sz w:val="20"/>
+                <w:szCs w:val="20"/>
               </w:rPr>
             </w:r>
           </w:p>
@@ -1545,16 +1509,15 @@
             <w:pPr>
               <w:pStyle w:val="normal1"/>
               <w:rPr>
-                <w:rFonts w:ascii="Arial" w:hAnsi="Arial"/>
-                <w:sz w:val="18"/>
-                <w:szCs w:val="18"/>
-              </w:rPr>
-            </w:pPr>
-            <w:r>
-              <w:rPr>
-                <w:rFonts w:eastAsia="Arial" w:cs="Arial" w:ascii="Arial" w:hAnsi="Arial"/>
-                <w:sz w:val="18"/>
-                <w:szCs w:val="18"/>
+                <w:sz w:val="20"/>
+                <w:szCs w:val="20"/>
+              </w:rPr>
+            </w:pPr>
+            <w:r>
+              <w:rPr>
+                <w:rFonts w:eastAsia="Arial" w:cs="Arial" w:ascii="Arial" w:hAnsi="Arial"/>
+                <w:sz w:val="20"/>
+                <w:szCs w:val="20"/>
               </w:rPr>
               <w:t>b) Total No. of Packages</w:t>
             </w:r>
@@ -1562,27 +1525,26 @@
         </w:tc>
         <w:tc>
           <w:tcPr>
-            <w:tcW w:w="4438" w:type="dxa"/>
-            <w:tcBorders>
-              <w:bottom w:val="single" w:sz="4" w:space="0" w:color="000000"/>
-              <w:right w:val="single" w:sz="4" w:space="0" w:color="000000"/>
-            </w:tcBorders>
-            <w:vAlign w:val="center"/>
-          </w:tcPr>
-          <w:p>
-            <w:pPr>
-              <w:pStyle w:val="normal1"/>
-              <w:rPr>
-                <w:rFonts w:ascii="Arial" w:hAnsi="Arial"/>
-                <w:sz w:val="18"/>
-                <w:szCs w:val="18"/>
-              </w:rPr>
-            </w:pPr>
-            <w:r>
-              <w:rPr>
-                <w:rFonts w:eastAsia="Arial" w:cs="Arial" w:ascii="Arial" w:hAnsi="Arial"/>
-                <w:sz w:val="18"/>
-                <w:szCs w:val="18"/>
+            <w:tcW w:w="4439" w:type="dxa"/>
+            <w:tcBorders>
+              <w:bottom w:val="single" w:sz="4" w:space="0" w:color="000000"/>
+              <w:right w:val="single" w:sz="4" w:space="0" w:color="000000"/>
+            </w:tcBorders>
+            <w:vAlign w:val="center"/>
+          </w:tcPr>
+          <w:p>
+            <w:pPr>
+              <w:pStyle w:val="normal1"/>
+              <w:rPr>
+                <w:sz w:val="20"/>
+                <w:szCs w:val="20"/>
+              </w:rPr>
+            </w:pPr>
+            <w:r>
+              <w:rPr>
+                <w:rFonts w:eastAsia="Arial" w:cs="Arial" w:ascii="Arial" w:hAnsi="Arial"/>
+                <w:sz w:val="20"/>
+                <w:szCs w:val="20"/>
               </w:rPr>
               <w:t>{{ total_packages }}</w:t>
             </w:r>
@@ -1595,7 +1557,7 @@
         </w:trPr>
         <w:tc>
           <w:tcPr>
-            <w:tcW w:w="518" w:type="dxa"/>
+            <w:tcW w:w="517" w:type="dxa"/>
             <w:tcBorders>
               <w:left w:val="single" w:sz="4" w:space="0" w:color="000000"/>
               <w:bottom w:val="single" w:sz="4" w:space="0" w:color="000000"/>
@@ -1609,15 +1571,15 @@
               <w:jc w:val="center"/>
               <w:rPr>
                 <w:rFonts w:ascii="Arial" w:hAnsi="Arial" w:eastAsia="Arial" w:cs="Arial"/>
-                <w:sz w:val="18"/>
-                <w:szCs w:val="18"/>
-              </w:rPr>
-            </w:pPr>
-            <w:r>
-              <w:rPr>
-                <w:rFonts w:eastAsia="Arial" w:cs="Arial" w:ascii="Arial" w:hAnsi="Arial"/>
-                <w:sz w:val="18"/>
-                <w:szCs w:val="18"/>
+                <w:sz w:val="20"/>
+                <w:szCs w:val="20"/>
+              </w:rPr>
+            </w:pPr>
+            <w:r>
+              <w:rPr>
+                <w:rFonts w:eastAsia="Arial" w:cs="Arial" w:ascii="Arial" w:hAnsi="Arial"/>
+                <w:sz w:val="20"/>
+                <w:szCs w:val="20"/>
               </w:rPr>
             </w:r>
           </w:p>
@@ -1635,16 +1597,15 @@
             <w:pPr>
               <w:pStyle w:val="normal1"/>
               <w:rPr>
-                <w:rFonts w:ascii="Arial" w:hAnsi="Arial"/>
-                <w:sz w:val="18"/>
-                <w:szCs w:val="18"/>
-              </w:rPr>
-            </w:pPr>
-            <w:r>
-              <w:rPr>
-                <w:rFonts w:eastAsia="Arial" w:cs="Arial" w:ascii="Arial" w:hAnsi="Arial"/>
-                <w:sz w:val="18"/>
-                <w:szCs w:val="18"/>
+                <w:sz w:val="20"/>
+                <w:szCs w:val="20"/>
+              </w:rPr>
+            </w:pPr>
+            <w:r>
+              <w:rPr>
+                <w:rFonts w:eastAsia="Arial" w:cs="Arial" w:ascii="Arial" w:hAnsi="Arial"/>
+                <w:sz w:val="20"/>
+                <w:szCs w:val="20"/>
               </w:rPr>
               <w:t>c) Name &amp; address of the consignee Abroad</w:t>
             </w:r>
@@ -1652,7 +1613,7 @@
         </w:tc>
         <w:tc>
           <w:tcPr>
-            <w:tcW w:w="4438" w:type="dxa"/>
+            <w:tcW w:w="4439" w:type="dxa"/>
             <w:tcBorders>
               <w:left w:val="single" w:sz="4" w:space="0" w:color="000000"/>
               <w:bottom w:val="single" w:sz="4" w:space="0" w:color="000000"/>
@@ -1664,16 +1625,15 @@
             <w:pPr>
               <w:pStyle w:val="normal1"/>
               <w:rPr>
-                <w:rFonts w:ascii="Arial" w:hAnsi="Arial"/>
-                <w:sz w:val="18"/>
-                <w:szCs w:val="18"/>
-              </w:rPr>
-            </w:pPr>
-            <w:r>
-              <w:rPr>
-                <w:rFonts w:eastAsia="Arial" w:cs="Arial" w:ascii="Arial" w:hAnsi="Arial"/>
-                <w:sz w:val="18"/>
-                <w:szCs w:val="18"/>
+                <w:sz w:val="20"/>
+                <w:szCs w:val="20"/>
+              </w:rPr>
+            </w:pPr>
+            <w:r>
+              <w:rPr>
+                <w:rFonts w:eastAsia="Arial" w:cs="Arial" w:ascii="Arial" w:hAnsi="Arial"/>
+                <w:sz w:val="20"/>
+                <w:szCs w:val="20"/>
               </w:rPr>
               <w:t>{{ notify_1 }}</w:t>
             </w:r>
@@ -1686,7 +1646,7 @@
         </w:trPr>
         <w:tc>
           <w:tcPr>
-            <w:tcW w:w="518" w:type="dxa"/>
+            <w:tcW w:w="517" w:type="dxa"/>
             <w:tcBorders>
               <w:left w:val="single" w:sz="4" w:space="0" w:color="000000"/>
               <w:bottom w:val="single" w:sz="4" w:space="0" w:color="000000"/>
@@ -1699,16 +1659,15 @@
               <w:pStyle w:val="normal1"/>
               <w:jc w:val="center"/>
               <w:rPr>
-                <w:rFonts w:ascii="Arial" w:hAnsi="Arial"/>
-                <w:sz w:val="18"/>
-                <w:szCs w:val="18"/>
-              </w:rPr>
-            </w:pPr>
-            <w:r>
-              <w:rPr>
-                <w:rFonts w:eastAsia="Arial" w:cs="Arial" w:ascii="Arial" w:hAnsi="Arial"/>
-                <w:sz w:val="18"/>
-                <w:szCs w:val="18"/>
+                <w:sz w:val="20"/>
+                <w:szCs w:val="20"/>
+              </w:rPr>
+            </w:pPr>
+            <w:r>
+              <w:rPr>
+                <w:rFonts w:eastAsia="Arial" w:cs="Arial" w:ascii="Arial" w:hAnsi="Arial"/>
+                <w:sz w:val="20"/>
+                <w:szCs w:val="20"/>
               </w:rPr>
               <w:t>10</w:t>
             </w:r>
@@ -1727,16 +1686,15 @@
             <w:pPr>
               <w:pStyle w:val="normal1"/>
               <w:rPr>
-                <w:rFonts w:ascii="Arial" w:hAnsi="Arial"/>
-                <w:sz w:val="18"/>
-                <w:szCs w:val="18"/>
-              </w:rPr>
-            </w:pPr>
-            <w:r>
-              <w:rPr>
-                <w:rFonts w:eastAsia="Arial" w:cs="Arial" w:ascii="Arial" w:hAnsi="Arial"/>
-                <w:sz w:val="18"/>
-                <w:szCs w:val="18"/>
+                <w:sz w:val="20"/>
+                <w:szCs w:val="20"/>
+              </w:rPr>
+            </w:pPr>
+            <w:r>
+              <w:rPr>
+                <w:rFonts w:eastAsia="Arial" w:cs="Arial" w:ascii="Arial" w:hAnsi="Arial"/>
+                <w:sz w:val="20"/>
+                <w:szCs w:val="20"/>
               </w:rPr>
               <w:t>(a) Is the description of the goods, the quantity and their value as per Particulars furnished in the export invoice?</w:t>
             </w:r>
@@ -1744,27 +1702,26 @@
         </w:tc>
         <w:tc>
           <w:tcPr>
-            <w:tcW w:w="4438" w:type="dxa"/>
-            <w:tcBorders>
-              <w:bottom w:val="single" w:sz="4" w:space="0" w:color="000000"/>
-              <w:right w:val="single" w:sz="4" w:space="0" w:color="000000"/>
-            </w:tcBorders>
-            <w:vAlign w:val="center"/>
-          </w:tcPr>
-          <w:p>
-            <w:pPr>
-              <w:pStyle w:val="normal1"/>
-              <w:rPr>
-                <w:rFonts w:ascii="Arial" w:hAnsi="Arial"/>
-                <w:sz w:val="18"/>
-                <w:szCs w:val="18"/>
-              </w:rPr>
-            </w:pPr>
-            <w:r>
-              <w:rPr>
-                <w:rFonts w:eastAsia="Arial" w:cs="Arial" w:ascii="Arial" w:hAnsi="Arial"/>
-                <w:sz w:val="18"/>
-                <w:szCs w:val="18"/>
+            <w:tcW w:w="4439" w:type="dxa"/>
+            <w:tcBorders>
+              <w:bottom w:val="single" w:sz="4" w:space="0" w:color="000000"/>
+              <w:right w:val="single" w:sz="4" w:space="0" w:color="000000"/>
+            </w:tcBorders>
+            <w:vAlign w:val="center"/>
+          </w:tcPr>
+          <w:p>
+            <w:pPr>
+              <w:pStyle w:val="normal1"/>
+              <w:rPr>
+                <w:sz w:val="20"/>
+                <w:szCs w:val="20"/>
+              </w:rPr>
+            </w:pPr>
+            <w:r>
+              <w:rPr>
+                <w:rFonts w:eastAsia="Arial" w:cs="Arial" w:ascii="Arial" w:hAnsi="Arial"/>
+                <w:sz w:val="20"/>
+                <w:szCs w:val="20"/>
               </w:rPr>
               <w:t>YES</w:t>
             </w:r>
@@ -1777,7 +1734,7 @@
         </w:trPr>
         <w:tc>
           <w:tcPr>
-            <w:tcW w:w="518" w:type="dxa"/>
+            <w:tcW w:w="517" w:type="dxa"/>
             <w:tcBorders>
               <w:left w:val="single" w:sz="4" w:space="0" w:color="000000"/>
               <w:bottom w:val="single" w:sz="4" w:space="0" w:color="000000"/>
@@ -1791,15 +1748,15 @@
               <w:jc w:val="center"/>
               <w:rPr>
                 <w:rFonts w:ascii="Arial" w:hAnsi="Arial" w:eastAsia="Arial" w:cs="Arial"/>
-                <w:sz w:val="18"/>
-                <w:szCs w:val="18"/>
-              </w:rPr>
-            </w:pPr>
-            <w:r>
-              <w:rPr>
-                <w:rFonts w:eastAsia="Arial" w:cs="Arial" w:ascii="Arial" w:hAnsi="Arial"/>
-                <w:sz w:val="18"/>
-                <w:szCs w:val="18"/>
+                <w:sz w:val="20"/>
+                <w:szCs w:val="20"/>
+              </w:rPr>
+            </w:pPr>
+            <w:r>
+              <w:rPr>
+                <w:rFonts w:eastAsia="Arial" w:cs="Arial" w:ascii="Arial" w:hAnsi="Arial"/>
+                <w:sz w:val="20"/>
+                <w:szCs w:val="20"/>
               </w:rPr>
             </w:r>
           </w:p>
@@ -1817,16 +1774,15 @@
             <w:pPr>
               <w:pStyle w:val="normal1"/>
               <w:rPr>
-                <w:rFonts w:ascii="Arial" w:hAnsi="Arial"/>
-                <w:sz w:val="18"/>
-                <w:szCs w:val="18"/>
-              </w:rPr>
-            </w:pPr>
-            <w:r>
-              <w:rPr>
-                <w:rFonts w:eastAsia="Arial" w:cs="Arial" w:ascii="Arial" w:hAnsi="Arial"/>
-                <w:sz w:val="18"/>
-                <w:szCs w:val="18"/>
+                <w:sz w:val="20"/>
+                <w:szCs w:val="20"/>
+              </w:rPr>
+            </w:pPr>
+            <w:r>
+              <w:rPr>
+                <w:rFonts w:eastAsia="Arial" w:cs="Arial" w:ascii="Arial" w:hAnsi="Arial"/>
+                <w:sz w:val="20"/>
+                <w:szCs w:val="20"/>
               </w:rPr>
               <w:t>(b) Whether sample is drawn for being forwarded to Port of export.</w:t>
             </w:r>
@@ -1834,27 +1790,26 @@
         </w:tc>
         <w:tc>
           <w:tcPr>
-            <w:tcW w:w="4438" w:type="dxa"/>
-            <w:tcBorders>
-              <w:bottom w:val="single" w:sz="4" w:space="0" w:color="000000"/>
-              <w:right w:val="single" w:sz="4" w:space="0" w:color="000000"/>
-            </w:tcBorders>
-            <w:vAlign w:val="center"/>
-          </w:tcPr>
-          <w:p>
-            <w:pPr>
-              <w:pStyle w:val="normal1"/>
-              <w:rPr>
-                <w:rFonts w:ascii="Arial" w:hAnsi="Arial"/>
-                <w:sz w:val="18"/>
-                <w:szCs w:val="18"/>
-              </w:rPr>
-            </w:pPr>
-            <w:r>
-              <w:rPr>
-                <w:rFonts w:eastAsia="Arial" w:cs="Arial" w:ascii="Arial" w:hAnsi="Arial"/>
-                <w:sz w:val="18"/>
-                <w:szCs w:val="18"/>
+            <w:tcW w:w="4439" w:type="dxa"/>
+            <w:tcBorders>
+              <w:bottom w:val="single" w:sz="4" w:space="0" w:color="000000"/>
+              <w:right w:val="single" w:sz="4" w:space="0" w:color="000000"/>
+            </w:tcBorders>
+            <w:vAlign w:val="center"/>
+          </w:tcPr>
+          <w:p>
+            <w:pPr>
+              <w:pStyle w:val="normal1"/>
+              <w:rPr>
+                <w:sz w:val="20"/>
+                <w:szCs w:val="20"/>
+              </w:rPr>
+            </w:pPr>
+            <w:r>
+              <w:rPr>
+                <w:rFonts w:eastAsia="Arial" w:cs="Arial" w:ascii="Arial" w:hAnsi="Arial"/>
+                <w:sz w:val="20"/>
+                <w:szCs w:val="20"/>
               </w:rPr>
               <w:t>NO</w:t>
             </w:r>
@@ -1867,7 +1822,7 @@
         </w:trPr>
         <w:tc>
           <w:tcPr>
-            <w:tcW w:w="518" w:type="dxa"/>
+            <w:tcW w:w="517" w:type="dxa"/>
             <w:tcBorders>
               <w:left w:val="single" w:sz="4" w:space="0" w:color="000000"/>
               <w:bottom w:val="single" w:sz="4" w:space="0" w:color="000000"/>
@@ -1881,15 +1836,15 @@
               <w:jc w:val="center"/>
               <w:rPr>
                 <w:rFonts w:ascii="Arial" w:hAnsi="Arial" w:eastAsia="Arial" w:cs="Arial"/>
-                <w:sz w:val="18"/>
-                <w:szCs w:val="18"/>
-              </w:rPr>
-            </w:pPr>
-            <w:r>
-              <w:rPr>
-                <w:rFonts w:eastAsia="Arial" w:cs="Arial" w:ascii="Arial" w:hAnsi="Arial"/>
-                <w:sz w:val="18"/>
-                <w:szCs w:val="18"/>
+                <w:sz w:val="20"/>
+                <w:szCs w:val="20"/>
+              </w:rPr>
+            </w:pPr>
+            <w:r>
+              <w:rPr>
+                <w:rFonts w:eastAsia="Arial" w:cs="Arial" w:ascii="Arial" w:hAnsi="Arial"/>
+                <w:sz w:val="20"/>
+                <w:szCs w:val="20"/>
               </w:rPr>
             </w:r>
           </w:p>
@@ -1907,16 +1862,15 @@
             <w:pPr>
               <w:pStyle w:val="normal1"/>
               <w:rPr>
-                <w:rFonts w:ascii="Arial" w:hAnsi="Arial"/>
-                <w:sz w:val="18"/>
-                <w:szCs w:val="18"/>
-              </w:rPr>
-            </w:pPr>
-            <w:r>
-              <w:rPr>
-                <w:rFonts w:eastAsia="Arial" w:cs="Arial" w:ascii="Arial" w:hAnsi="Arial"/>
-                <w:sz w:val="18"/>
-                <w:szCs w:val="18"/>
+                <w:sz w:val="20"/>
+                <w:szCs w:val="20"/>
+              </w:rPr>
+            </w:pPr>
+            <w:r>
+              <w:rPr>
+                <w:rFonts w:eastAsia="Arial" w:cs="Arial" w:ascii="Arial" w:hAnsi="Arial"/>
+                <w:sz w:val="20"/>
+                <w:szCs w:val="20"/>
               </w:rPr>
               <w:t>c) If yes, the number of the seal of the Package containing the sample.</w:t>
             </w:r>
@@ -1924,27 +1878,26 @@
         </w:tc>
         <w:tc>
           <w:tcPr>
-            <w:tcW w:w="4438" w:type="dxa"/>
-            <w:tcBorders>
-              <w:bottom w:val="single" w:sz="4" w:space="0" w:color="000000"/>
-              <w:right w:val="single" w:sz="4" w:space="0" w:color="000000"/>
-            </w:tcBorders>
-            <w:vAlign w:val="center"/>
-          </w:tcPr>
-          <w:p>
-            <w:pPr>
-              <w:pStyle w:val="normal1"/>
-              <w:rPr>
-                <w:rFonts w:ascii="Arial" w:hAnsi="Arial"/>
-                <w:sz w:val="18"/>
-                <w:szCs w:val="18"/>
-              </w:rPr>
-            </w:pPr>
-            <w:r>
-              <w:rPr>
-                <w:rFonts w:eastAsia="Arial" w:cs="Arial" w:ascii="Arial" w:hAnsi="Arial"/>
-                <w:sz w:val="18"/>
-                <w:szCs w:val="18"/>
+            <w:tcW w:w="4439" w:type="dxa"/>
+            <w:tcBorders>
+              <w:bottom w:val="single" w:sz="4" w:space="0" w:color="000000"/>
+              <w:right w:val="single" w:sz="4" w:space="0" w:color="000000"/>
+            </w:tcBorders>
+            <w:vAlign w:val="center"/>
+          </w:tcPr>
+          <w:p>
+            <w:pPr>
+              <w:pStyle w:val="normal1"/>
+              <w:rPr>
+                <w:sz w:val="20"/>
+                <w:szCs w:val="20"/>
+              </w:rPr>
+            </w:pPr>
+            <w:r>
+              <w:rPr>
+                <w:rFonts w:eastAsia="Arial" w:cs="Arial" w:ascii="Arial" w:hAnsi="Arial"/>
+                <w:sz w:val="20"/>
+                <w:szCs w:val="20"/>
               </w:rPr>
               <w:t>NO</w:t>
             </w:r>
@@ -1957,7 +1910,7 @@
         </w:trPr>
         <w:tc>
           <w:tcPr>
-            <w:tcW w:w="518" w:type="dxa"/>
+            <w:tcW w:w="517" w:type="dxa"/>
             <w:tcBorders>
               <w:left w:val="single" w:sz="4" w:space="0" w:color="000000"/>
               <w:bottom w:val="single" w:sz="4" w:space="0" w:color="000000"/>
@@ -1970,16 +1923,15 @@
               <w:pStyle w:val="normal1"/>
               <w:jc w:val="center"/>
               <w:rPr>
-                <w:rFonts w:ascii="Arial" w:hAnsi="Arial"/>
-                <w:sz w:val="18"/>
-                <w:szCs w:val="18"/>
-              </w:rPr>
-            </w:pPr>
-            <w:r>
-              <w:rPr>
-                <w:rFonts w:eastAsia="Arial" w:cs="Arial" w:ascii="Arial" w:hAnsi="Arial"/>
-                <w:sz w:val="18"/>
-                <w:szCs w:val="18"/>
+                <w:sz w:val="20"/>
+                <w:szCs w:val="20"/>
+              </w:rPr>
+            </w:pPr>
+            <w:r>
+              <w:rPr>
+                <w:rFonts w:eastAsia="Arial" w:cs="Arial" w:ascii="Arial" w:hAnsi="Arial"/>
+                <w:sz w:val="20"/>
+                <w:szCs w:val="20"/>
               </w:rPr>
               <w:t>11</w:t>
             </w:r>
@@ -1998,16 +1950,15 @@
             <w:pPr>
               <w:pStyle w:val="normal1"/>
               <w:rPr>
-                <w:rFonts w:ascii="Arial" w:hAnsi="Arial"/>
-                <w:sz w:val="18"/>
-                <w:szCs w:val="18"/>
-              </w:rPr>
-            </w:pPr>
-            <w:r>
-              <w:rPr>
-                <w:rFonts w:eastAsia="Arial" w:cs="Arial" w:ascii="Arial" w:hAnsi="Arial"/>
-                <w:sz w:val="18"/>
-                <w:szCs w:val="18"/>
+                <w:sz w:val="20"/>
+                <w:szCs w:val="20"/>
+              </w:rPr>
+            </w:pPr>
+            <w:r>
+              <w:rPr>
+                <w:rFonts w:eastAsia="Arial" w:cs="Arial" w:ascii="Arial" w:hAnsi="Arial"/>
+                <w:sz w:val="20"/>
+                <w:szCs w:val="20"/>
               </w:rPr>
               <w:t>Company One time Bottle seal</w:t>
             </w:r>
@@ -2015,28 +1966,27 @@
         </w:tc>
         <w:tc>
           <w:tcPr>
-            <w:tcW w:w="4438" w:type="dxa"/>
-            <w:tcBorders>
-              <w:bottom w:val="single" w:sz="4" w:space="0" w:color="000000"/>
-              <w:right w:val="single" w:sz="4" w:space="0" w:color="000000"/>
-            </w:tcBorders>
-            <w:vAlign w:val="center"/>
-          </w:tcPr>
-          <w:p>
-            <w:pPr>
-              <w:pStyle w:val="normal1"/>
-              <w:rPr>
-                <w:rFonts w:ascii="Arial" w:hAnsi="Arial"/>
-                <w:sz w:val="18"/>
-                <w:szCs w:val="18"/>
+            <w:tcW w:w="4439" w:type="dxa"/>
+            <w:tcBorders>
+              <w:bottom w:val="single" w:sz="4" w:space="0" w:color="000000"/>
+              <w:right w:val="single" w:sz="4" w:space="0" w:color="000000"/>
+            </w:tcBorders>
+            <w:vAlign w:val="center"/>
+          </w:tcPr>
+          <w:p>
+            <w:pPr>
+              <w:pStyle w:val="normal1"/>
+              <w:rPr>
+                <w:sz w:val="20"/>
+                <w:szCs w:val="20"/>
               </w:rPr>
             </w:pPr>
             <w:r>
               <w:rPr>
                 <w:rFonts w:eastAsia="Arial" w:cs="Arial" w:ascii="Arial" w:hAnsi="Arial"/>
                 <w:color w:val="000000"/>
-                <w:sz w:val="18"/>
-                <w:szCs w:val="18"/>
+                <w:sz w:val="20"/>
+                <w:szCs w:val="20"/>
               </w:rPr>
               <w:t xml:space="preserve"> </w:t>
             </w:r>
@@ -2044,8 +1994,8 @@
               <w:rPr>
                 <w:rFonts w:eastAsia="Arial" w:cs="Arial" w:ascii="Arial" w:hAnsi="Arial"/>
                 <w:color w:val="000000"/>
-                <w:sz w:val="18"/>
-                <w:szCs w:val="18"/>
+                <w:sz w:val="20"/>
+                <w:szCs w:val="20"/>
               </w:rPr>
               <w:t>{{ company_seal_no }}</w:t>
             </w:r>
@@ -2058,7 +2008,7 @@
         </w:trPr>
         <w:tc>
           <w:tcPr>
-            <w:tcW w:w="518" w:type="dxa"/>
+            <w:tcW w:w="517" w:type="dxa"/>
             <w:tcBorders>
               <w:left w:val="single" w:sz="4" w:space="0" w:color="000000"/>
               <w:bottom w:val="single" w:sz="4" w:space="0" w:color="000000"/>
@@ -2071,16 +2021,15 @@
               <w:pStyle w:val="normal1"/>
               <w:jc w:val="center"/>
               <w:rPr>
-                <w:rFonts w:ascii="Arial" w:hAnsi="Arial"/>
-                <w:sz w:val="18"/>
-                <w:szCs w:val="18"/>
-              </w:rPr>
-            </w:pPr>
-            <w:r>
-              <w:rPr>
-                <w:rFonts w:eastAsia="Arial" w:cs="Arial" w:ascii="Arial" w:hAnsi="Arial"/>
-                <w:sz w:val="18"/>
-                <w:szCs w:val="18"/>
+                <w:sz w:val="20"/>
+                <w:szCs w:val="20"/>
+              </w:rPr>
+            </w:pPr>
+            <w:r>
+              <w:rPr>
+                <w:rFonts w:eastAsia="Arial" w:cs="Arial" w:ascii="Arial" w:hAnsi="Arial"/>
+                <w:sz w:val="20"/>
+                <w:szCs w:val="20"/>
               </w:rPr>
               <w:t>12</w:t>
             </w:r>
@@ -2099,16 +2048,15 @@
             <w:pPr>
               <w:pStyle w:val="normal1"/>
               <w:rPr>
-                <w:rFonts w:ascii="Arial" w:hAnsi="Arial"/>
-                <w:sz w:val="18"/>
-                <w:szCs w:val="18"/>
-              </w:rPr>
-            </w:pPr>
-            <w:r>
-              <w:rPr>
-                <w:rFonts w:eastAsia="Arial" w:cs="Arial" w:ascii="Arial" w:hAnsi="Arial"/>
-                <w:sz w:val="18"/>
-                <w:szCs w:val="18"/>
+                <w:sz w:val="20"/>
+                <w:szCs w:val="20"/>
+              </w:rPr>
+            </w:pPr>
+            <w:r>
+              <w:rPr>
+                <w:rFonts w:eastAsia="Arial" w:cs="Arial" w:ascii="Arial" w:hAnsi="Arial"/>
+                <w:sz w:val="20"/>
+                <w:szCs w:val="20"/>
               </w:rPr>
               <w:t>Shipping Line seal no.</w:t>
             </w:r>
@@ -2116,28 +2064,27 @@
         </w:tc>
         <w:tc>
           <w:tcPr>
-            <w:tcW w:w="4438" w:type="dxa"/>
-            <w:tcBorders>
-              <w:bottom w:val="single" w:sz="4" w:space="0" w:color="000000"/>
-              <w:right w:val="single" w:sz="4" w:space="0" w:color="000000"/>
-            </w:tcBorders>
-            <w:vAlign w:val="center"/>
-          </w:tcPr>
-          <w:p>
-            <w:pPr>
-              <w:pStyle w:val="normal1"/>
-              <w:rPr>
-                <w:rFonts w:ascii="Arial" w:hAnsi="Arial"/>
-                <w:sz w:val="18"/>
-                <w:szCs w:val="18"/>
+            <w:tcW w:w="4439" w:type="dxa"/>
+            <w:tcBorders>
+              <w:bottom w:val="single" w:sz="4" w:space="0" w:color="000000"/>
+              <w:right w:val="single" w:sz="4" w:space="0" w:color="000000"/>
+            </w:tcBorders>
+            <w:vAlign w:val="center"/>
+          </w:tcPr>
+          <w:p>
+            <w:pPr>
+              <w:pStyle w:val="normal1"/>
+              <w:rPr>
+                <w:sz w:val="20"/>
+                <w:szCs w:val="20"/>
               </w:rPr>
             </w:pPr>
             <w:r>
               <w:rPr>
                 <w:rFonts w:eastAsia="Arial" w:cs="Arial" w:ascii="Arial" w:hAnsi="Arial"/>
                 <w:color w:val="000000"/>
-                <w:sz w:val="18"/>
-                <w:szCs w:val="18"/>
+                <w:sz w:val="20"/>
+                <w:szCs w:val="20"/>
               </w:rPr>
               <w:t>{{ shipping_line_seal_no }}</w:t>
             </w:r>
@@ -2150,7 +2097,7 @@
         </w:trPr>
         <w:tc>
           <w:tcPr>
-            <w:tcW w:w="518" w:type="dxa"/>
+            <w:tcW w:w="517" w:type="dxa"/>
             <w:tcBorders>
               <w:left w:val="single" w:sz="4" w:space="0" w:color="000000"/>
               <w:bottom w:val="single" w:sz="4" w:space="0" w:color="000000"/>
@@ -2163,16 +2110,15 @@
               <w:pStyle w:val="normal1"/>
               <w:jc w:val="center"/>
               <w:rPr>
-                <w:rFonts w:ascii="Arial" w:hAnsi="Arial"/>
-                <w:sz w:val="18"/>
-                <w:szCs w:val="18"/>
-              </w:rPr>
-            </w:pPr>
-            <w:r>
-              <w:rPr>
-                <w:rFonts w:eastAsia="Arial" w:cs="Arial" w:ascii="Arial" w:hAnsi="Arial"/>
-                <w:sz w:val="18"/>
-                <w:szCs w:val="18"/>
+                <w:sz w:val="20"/>
+                <w:szCs w:val="20"/>
+              </w:rPr>
+            </w:pPr>
+            <w:r>
+              <w:rPr>
+                <w:rFonts w:eastAsia="Arial" w:cs="Arial" w:ascii="Arial" w:hAnsi="Arial"/>
+                <w:sz w:val="20"/>
+                <w:szCs w:val="20"/>
               </w:rPr>
               <w:t>13</w:t>
             </w:r>
@@ -2191,16 +2137,15 @@
             <w:pPr>
               <w:pStyle w:val="normal1"/>
               <w:rPr>
-                <w:rFonts w:ascii="Arial" w:hAnsi="Arial"/>
-                <w:sz w:val="18"/>
-                <w:szCs w:val="18"/>
-              </w:rPr>
-            </w:pPr>
-            <w:r>
-              <w:rPr>
-                <w:rFonts w:eastAsia="Arial" w:cs="Arial" w:ascii="Arial" w:hAnsi="Arial"/>
-                <w:sz w:val="18"/>
-                <w:szCs w:val="18"/>
+                <w:sz w:val="20"/>
+                <w:szCs w:val="20"/>
+              </w:rPr>
+            </w:pPr>
+            <w:r>
+              <w:rPr>
+                <w:rFonts w:eastAsia="Arial" w:cs="Arial" w:ascii="Arial" w:hAnsi="Arial"/>
+                <w:sz w:val="20"/>
+                <w:szCs w:val="20"/>
               </w:rPr>
               <w:t>Container No.</w:t>
             </w:r>
@@ -2208,28 +2153,27 @@
         </w:tc>
         <w:tc>
           <w:tcPr>
-            <w:tcW w:w="4438" w:type="dxa"/>
-            <w:tcBorders>
-              <w:bottom w:val="single" w:sz="4" w:space="0" w:color="000000"/>
-              <w:right w:val="single" w:sz="4" w:space="0" w:color="000000"/>
-            </w:tcBorders>
-            <w:vAlign w:val="center"/>
-          </w:tcPr>
-          <w:p>
-            <w:pPr>
-              <w:pStyle w:val="normal1"/>
-              <w:rPr>
-                <w:rFonts w:ascii="Arial" w:hAnsi="Arial"/>
-                <w:sz w:val="18"/>
-                <w:szCs w:val="18"/>
+            <w:tcW w:w="4439" w:type="dxa"/>
+            <w:tcBorders>
+              <w:bottom w:val="single" w:sz="4" w:space="0" w:color="000000"/>
+              <w:right w:val="single" w:sz="4" w:space="0" w:color="000000"/>
+            </w:tcBorders>
+            <w:vAlign w:val="center"/>
+          </w:tcPr>
+          <w:p>
+            <w:pPr>
+              <w:pStyle w:val="normal1"/>
+              <w:rPr>
+                <w:sz w:val="20"/>
+                <w:szCs w:val="20"/>
               </w:rPr>
             </w:pPr>
             <w:r>
               <w:rPr>
                 <w:rFonts w:eastAsia="Arial" w:cs="Arial" w:ascii="Arial" w:hAnsi="Arial"/>
                 <w:color w:val="000000"/>
-                <w:sz w:val="18"/>
-                <w:szCs w:val="18"/>
+                <w:sz w:val="20"/>
+                <w:szCs w:val="20"/>
               </w:rPr>
               <w:t>{{ container_no }}</w:t>
             </w:r>
@@ -2242,7 +2186,7 @@
         </w:trPr>
         <w:tc>
           <w:tcPr>
-            <w:tcW w:w="518" w:type="dxa"/>
+            <w:tcW w:w="517" w:type="dxa"/>
             <w:tcBorders>
               <w:left w:val="single" w:sz="4" w:space="0" w:color="000000"/>
               <w:bottom w:val="single" w:sz="4" w:space="0" w:color="000000"/>
@@ -2255,16 +2199,15 @@
               <w:pStyle w:val="normal1"/>
               <w:jc w:val="center"/>
               <w:rPr>
-                <w:rFonts w:ascii="Arial" w:hAnsi="Arial"/>
-                <w:sz w:val="18"/>
-                <w:szCs w:val="18"/>
-              </w:rPr>
-            </w:pPr>
-            <w:r>
-              <w:rPr>
-                <w:rFonts w:eastAsia="Arial" w:cs="Arial" w:ascii="Arial" w:hAnsi="Arial"/>
-                <w:sz w:val="18"/>
-                <w:szCs w:val="18"/>
+                <w:sz w:val="20"/>
+                <w:szCs w:val="20"/>
+              </w:rPr>
+            </w:pPr>
+            <w:r>
+              <w:rPr>
+                <w:rFonts w:eastAsia="Arial" w:cs="Arial" w:ascii="Arial" w:hAnsi="Arial"/>
+                <w:sz w:val="20"/>
+                <w:szCs w:val="20"/>
               </w:rPr>
               <w:t>14</w:t>
             </w:r>
@@ -2283,16 +2226,15 @@
             <w:pPr>
               <w:pStyle w:val="normal1"/>
               <w:rPr>
-                <w:rFonts w:ascii="Arial" w:hAnsi="Arial"/>
-                <w:sz w:val="18"/>
-                <w:szCs w:val="18"/>
-              </w:rPr>
-            </w:pPr>
-            <w:r>
-              <w:rPr>
-                <w:rFonts w:eastAsia="Arial" w:cs="Arial" w:ascii="Arial" w:hAnsi="Arial"/>
-                <w:sz w:val="18"/>
-                <w:szCs w:val="18"/>
+                <w:sz w:val="20"/>
+                <w:szCs w:val="20"/>
+              </w:rPr>
+            </w:pPr>
+            <w:r>
+              <w:rPr>
+                <w:rFonts w:eastAsia="Arial" w:cs="Arial" w:ascii="Arial" w:hAnsi="Arial"/>
+                <w:sz w:val="20"/>
+                <w:szCs w:val="20"/>
               </w:rPr>
               <w:t>Type of Container</w:t>
             </w:r>
@@ -2300,27 +2242,26 @@
         </w:tc>
         <w:tc>
           <w:tcPr>
-            <w:tcW w:w="4438" w:type="dxa"/>
-            <w:tcBorders>
-              <w:bottom w:val="single" w:sz="4" w:space="0" w:color="000000"/>
-              <w:right w:val="single" w:sz="4" w:space="0" w:color="000000"/>
-            </w:tcBorders>
-            <w:vAlign w:val="center"/>
-          </w:tcPr>
-          <w:p>
-            <w:pPr>
-              <w:pStyle w:val="normal1"/>
-              <w:rPr>
-                <w:rFonts w:ascii="Arial" w:hAnsi="Arial"/>
-                <w:sz w:val="18"/>
-                <w:szCs w:val="18"/>
-              </w:rPr>
-            </w:pPr>
-            <w:r>
-              <w:rPr>
-                <w:rFonts w:eastAsia="Arial" w:cs="Arial" w:ascii="Arial" w:hAnsi="Arial"/>
-                <w:sz w:val="18"/>
-                <w:szCs w:val="18"/>
+            <w:tcW w:w="4439" w:type="dxa"/>
+            <w:tcBorders>
+              <w:bottom w:val="single" w:sz="4" w:space="0" w:color="000000"/>
+              <w:right w:val="single" w:sz="4" w:space="0" w:color="000000"/>
+            </w:tcBorders>
+            <w:vAlign w:val="center"/>
+          </w:tcPr>
+          <w:p>
+            <w:pPr>
+              <w:pStyle w:val="normal1"/>
+              <w:rPr>
+                <w:sz w:val="20"/>
+                <w:szCs w:val="20"/>
+              </w:rPr>
+            </w:pPr>
+            <w:r>
+              <w:rPr>
+                <w:rFonts w:eastAsia="Arial" w:cs="Arial" w:ascii="Arial" w:hAnsi="Arial"/>
+                <w:sz w:val="20"/>
+                <w:szCs w:val="20"/>
               </w:rPr>
               <w:t>{{ container_type }}</w:t>
             </w:r>
@@ -2333,7 +2274,7 @@
         </w:trPr>
         <w:tc>
           <w:tcPr>
-            <w:tcW w:w="518" w:type="dxa"/>
+            <w:tcW w:w="517" w:type="dxa"/>
             <w:tcBorders>
               <w:left w:val="single" w:sz="4" w:space="0" w:color="000000"/>
               <w:bottom w:val="single" w:sz="4" w:space="0" w:color="000000"/>
@@ -2347,15 +2288,15 @@
               <w:jc w:val="center"/>
               <w:rPr>
                 <w:rFonts w:ascii="Arial" w:hAnsi="Arial" w:eastAsia="Arial" w:cs="Arial"/>
-                <w:sz w:val="18"/>
-                <w:szCs w:val="18"/>
-              </w:rPr>
-            </w:pPr>
-            <w:r>
-              <w:rPr>
-                <w:rFonts w:eastAsia="Arial" w:cs="Arial" w:ascii="Arial" w:hAnsi="Arial"/>
-                <w:sz w:val="18"/>
-                <w:szCs w:val="18"/>
+                <w:sz w:val="20"/>
+                <w:szCs w:val="20"/>
+              </w:rPr>
+            </w:pPr>
+            <w:r>
+              <w:rPr>
+                <w:rFonts w:eastAsia="Arial" w:cs="Arial" w:ascii="Arial" w:hAnsi="Arial"/>
+                <w:sz w:val="20"/>
+                <w:szCs w:val="20"/>
               </w:rPr>
             </w:r>
           </w:p>
@@ -2373,16 +2314,15 @@
             <w:pPr>
               <w:pStyle w:val="normal1"/>
               <w:rPr>
-                <w:rFonts w:ascii="Arial" w:hAnsi="Arial"/>
-                <w:sz w:val="18"/>
-                <w:szCs w:val="18"/>
-              </w:rPr>
-            </w:pPr>
-            <w:r>
-              <w:rPr>
-                <w:rFonts w:eastAsia="Arial" w:cs="Arial" w:ascii="Arial" w:hAnsi="Arial"/>
-                <w:sz w:val="18"/>
-                <w:szCs w:val="18"/>
+                <w:sz w:val="20"/>
+                <w:szCs w:val="20"/>
+              </w:rPr>
+            </w:pPr>
+            <w:r>
+              <w:rPr>
+                <w:rFonts w:eastAsia="Arial" w:cs="Arial" w:ascii="Arial" w:hAnsi="Arial"/>
+                <w:sz w:val="20"/>
+                <w:szCs w:val="20"/>
               </w:rPr>
               <w:t>No. of Packages Stuffed in Container.</w:t>
             </w:r>
@@ -2390,27 +2330,26 @@
         </w:tc>
         <w:tc>
           <w:tcPr>
-            <w:tcW w:w="4438" w:type="dxa"/>
-            <w:tcBorders>
-              <w:bottom w:val="single" w:sz="4" w:space="0" w:color="000000"/>
-              <w:right w:val="single" w:sz="4" w:space="0" w:color="000000"/>
-            </w:tcBorders>
-            <w:vAlign w:val="center"/>
-          </w:tcPr>
-          <w:p>
-            <w:pPr>
-              <w:pStyle w:val="normal1"/>
-              <w:rPr>
-                <w:rFonts w:ascii="Arial" w:hAnsi="Arial"/>
-                <w:sz w:val="18"/>
-                <w:szCs w:val="18"/>
-              </w:rPr>
-            </w:pPr>
-            <w:r>
-              <w:rPr>
-                <w:rFonts w:eastAsia="Arial" w:cs="Arial" w:ascii="Arial" w:hAnsi="Arial"/>
-                <w:sz w:val="18"/>
-                <w:szCs w:val="18"/>
+            <w:tcW w:w="4439" w:type="dxa"/>
+            <w:tcBorders>
+              <w:bottom w:val="single" w:sz="4" w:space="0" w:color="000000"/>
+              <w:right w:val="single" w:sz="4" w:space="0" w:color="000000"/>
+            </w:tcBorders>
+            <w:vAlign w:val="center"/>
+          </w:tcPr>
+          <w:p>
+            <w:pPr>
+              <w:pStyle w:val="normal1"/>
+              <w:rPr>
+                <w:sz w:val="20"/>
+                <w:szCs w:val="20"/>
+              </w:rPr>
+            </w:pPr>
+            <w:r>
+              <w:rPr>
+                <w:rFonts w:eastAsia="Arial" w:cs="Arial" w:ascii="Arial" w:hAnsi="Arial"/>
+                <w:sz w:val="20"/>
+                <w:szCs w:val="20"/>
               </w:rPr>
               <w:t>{{ total_packages }}</w:t>
             </w:r>
@@ -2423,7 +2362,7 @@
         </w:trPr>
         <w:tc>
           <w:tcPr>
-            <w:tcW w:w="518" w:type="dxa"/>
+            <w:tcW w:w="517" w:type="dxa"/>
             <w:vMerge w:val="restart"/>
             <w:tcBorders>
               <w:top w:val="single" w:sz="4" w:space="0" w:color="000000"/>
@@ -2437,16 +2376,15 @@
               <w:pStyle w:val="normal1"/>
               <w:jc w:val="center"/>
               <w:rPr>
-                <w:rFonts w:ascii="Arial" w:hAnsi="Arial"/>
-                <w:sz w:val="18"/>
-                <w:szCs w:val="18"/>
-              </w:rPr>
-            </w:pPr>
-            <w:r>
-              <w:rPr>
-                <w:rFonts w:eastAsia="Arial" w:cs="Arial" w:ascii="Arial" w:hAnsi="Arial"/>
-                <w:sz w:val="18"/>
-                <w:szCs w:val="18"/>
+                <w:sz w:val="20"/>
+                <w:szCs w:val="20"/>
+              </w:rPr>
+            </w:pPr>
+            <w:r>
+              <w:rPr>
+                <w:rFonts w:eastAsia="Arial" w:cs="Arial" w:ascii="Arial" w:hAnsi="Arial"/>
+                <w:sz w:val="20"/>
+                <w:szCs w:val="20"/>
               </w:rPr>
               <w:t>15</w:t>
             </w:r>
@@ -2466,16 +2404,15 @@
             <w:pPr>
               <w:pStyle w:val="normal1"/>
               <w:rPr>
-                <w:rFonts w:ascii="Arial" w:hAnsi="Arial"/>
-                <w:sz w:val="18"/>
-                <w:szCs w:val="18"/>
-              </w:rPr>
-            </w:pPr>
-            <w:r>
-              <w:rPr>
-                <w:rFonts w:eastAsia="Arial" w:cs="Arial" w:ascii="Arial" w:hAnsi="Arial"/>
-                <w:sz w:val="18"/>
-                <w:szCs w:val="18"/>
+                <w:sz w:val="20"/>
+                <w:szCs w:val="20"/>
+              </w:rPr>
+            </w:pPr>
+            <w:r>
+              <w:rPr>
+                <w:rFonts w:eastAsia="Arial" w:cs="Arial" w:ascii="Arial" w:hAnsi="Arial"/>
+                <w:sz w:val="20"/>
+                <w:szCs w:val="20"/>
               </w:rPr>
               <w:t>Vehicles</w:t>
             </w:r>
@@ -2483,7 +2420,7 @@
         </w:tc>
         <w:tc>
           <w:tcPr>
-            <w:tcW w:w="4438" w:type="dxa"/>
+            <w:tcW w:w="4439" w:type="dxa"/>
             <w:tcBorders>
               <w:top w:val="single" w:sz="4" w:space="0" w:color="000000"/>
               <w:bottom w:val="single" w:sz="4" w:space="0" w:color="000000"/>
@@ -2496,15 +2433,15 @@
               <w:pStyle w:val="normal1"/>
               <w:rPr>
                 <w:rFonts w:ascii="Arial" w:hAnsi="Arial" w:eastAsia="Arial" w:cs="Arial"/>
-                <w:sz w:val="18"/>
-                <w:szCs w:val="18"/>
-              </w:rPr>
-            </w:pPr>
-            <w:r>
-              <w:rPr>
-                <w:rFonts w:eastAsia="Arial" w:cs="Arial" w:ascii="Arial" w:hAnsi="Arial"/>
-                <w:sz w:val="18"/>
-                <w:szCs w:val="18"/>
+                <w:sz w:val="20"/>
+                <w:szCs w:val="20"/>
+              </w:rPr>
+            </w:pPr>
+            <w:r>
+              <w:rPr>
+                <w:rFonts w:eastAsia="Arial" w:cs="Arial" w:ascii="Arial" w:hAnsi="Arial"/>
+                <w:sz w:val="20"/>
+                <w:szCs w:val="20"/>
               </w:rPr>
             </w:r>
           </w:p>
@@ -2516,7 +2453,7 @@
         </w:trPr>
         <w:tc>
           <w:tcPr>
-            <w:tcW w:w="518" w:type="dxa"/>
+            <w:tcW w:w="517" w:type="dxa"/>
             <w:vMerge w:val="continue"/>
             <w:tcBorders>
               <w:top w:val="single" w:sz="4" w:space="0" w:color="000000"/>
@@ -2537,15 +2474,15 @@
               <w:jc w:val="left"/>
               <w:rPr>
                 <w:rFonts w:ascii="Arial" w:hAnsi="Arial" w:eastAsia="Arial" w:cs="Arial"/>
-                <w:sz w:val="18"/>
-                <w:szCs w:val="18"/>
-              </w:rPr>
-            </w:pPr>
-            <w:r>
-              <w:rPr>
-                <w:rFonts w:eastAsia="Arial" w:cs="Arial" w:ascii="Arial" w:hAnsi="Arial"/>
-                <w:sz w:val="18"/>
-                <w:szCs w:val="18"/>
+                <w:sz w:val="20"/>
+                <w:szCs w:val="20"/>
+              </w:rPr>
+            </w:pPr>
+            <w:r>
+              <w:rPr>
+                <w:rFonts w:eastAsia="Arial" w:cs="Arial" w:ascii="Arial" w:hAnsi="Arial"/>
+                <w:sz w:val="20"/>
+                <w:szCs w:val="20"/>
               </w:rPr>
             </w:r>
           </w:p>
@@ -2564,16 +2501,15 @@
             <w:pPr>
               <w:pStyle w:val="normal1"/>
               <w:rPr>
-                <w:rFonts w:ascii="Arial" w:hAnsi="Arial"/>
-                <w:sz w:val="18"/>
-                <w:szCs w:val="18"/>
-              </w:rPr>
-            </w:pPr>
-            <w:r>
-              <w:rPr>
-                <w:rFonts w:eastAsia="Arial" w:cs="Arial" w:ascii="Arial" w:hAnsi="Arial"/>
-                <w:sz w:val="18"/>
-                <w:szCs w:val="18"/>
+                <w:sz w:val="20"/>
+                <w:szCs w:val="20"/>
+              </w:rPr>
+            </w:pPr>
+            <w:r>
+              <w:rPr>
+                <w:rFonts w:eastAsia="Arial" w:cs="Arial" w:ascii="Arial" w:hAnsi="Arial"/>
+                <w:sz w:val="20"/>
+                <w:szCs w:val="20"/>
               </w:rPr>
               <w:t>{{ vehicle_models_list }}</w:t>
             </w:r>
@@ -2581,7 +2517,7 @@
         </w:tc>
         <w:tc>
           <w:tcPr>
-            <w:tcW w:w="4438" w:type="dxa"/>
+            <w:tcW w:w="4439" w:type="dxa"/>
             <w:tcBorders>
               <w:top w:val="single" w:sz="4" w:space="0" w:color="000000"/>
               <w:bottom w:val="single" w:sz="4" w:space="0" w:color="000000"/>
@@ -2596,8 +2532,8 @@
                 <w:rFonts w:ascii="Arial" w:hAnsi="Arial" w:eastAsia="Arial" w:cs="Arial"/>
                 <w:b/>
                 <w:bCs/>
-                <w:sz w:val="18"/>
-                <w:szCs w:val="18"/>
+                <w:sz w:val="20"/>
+                <w:szCs w:val="20"/>
               </w:rPr>
             </w:pPr>
             <w:r>
@@ -2605,8 +2541,8 @@
                 <w:rFonts w:eastAsia="Arial" w:cs="Arial" w:ascii="Arial" w:hAnsi="Arial"/>
                 <w:b/>
                 <w:bCs/>
-                <w:sz w:val="18"/>
-                <w:szCs w:val="18"/>
+                <w:sz w:val="20"/>
+                <w:szCs w:val="20"/>
               </w:rPr>
             </w:r>
           </w:p>
@@ -2618,7 +2554,7 @@
         </w:trPr>
         <w:tc>
           <w:tcPr>
-            <w:tcW w:w="5423" w:type="dxa"/>
+            <w:tcW w:w="5422" w:type="dxa"/>
             <w:gridSpan w:val="2"/>
             <w:tcBorders>
               <w:top w:val="single" w:sz="4" w:space="0" w:color="000000"/>
@@ -2630,9 +2566,8 @@
             <w:pPr>
               <w:pStyle w:val="normal1"/>
               <w:rPr>
-                <w:rFonts w:ascii="Arial" w:hAnsi="Arial"/>
-                <w:sz w:val="18"/>
-                <w:szCs w:val="18"/>
+                <w:sz w:val="20"/>
+                <w:szCs w:val="20"/>
               </w:rPr>
             </w:pPr>
             <w:r>
@@ -2640,8 +2575,8 @@
                 <w:rFonts w:eastAsia="Arial" w:cs="Arial" w:ascii="Arial" w:hAnsi="Arial"/>
                 <w:b/>
                 <w:bCs/>
-                <w:sz w:val="18"/>
-                <w:szCs w:val="18"/>
+                <w:sz w:val="20"/>
+                <w:szCs w:val="20"/>
               </w:rPr>
               <w:t>For Horizon Enterprise</w:t>
             </w:r>
@@ -2649,7 +2584,7 @@
         </w:tc>
         <w:tc>
           <w:tcPr>
-            <w:tcW w:w="4438" w:type="dxa"/>
+            <w:tcW w:w="4439" w:type="dxa"/>
             <w:tcBorders>
               <w:top w:val="single" w:sz="4" w:space="0" w:color="000000"/>
               <w:right w:val="single" w:sz="4" w:space="0" w:color="000000"/>
@@ -2661,15 +2596,15 @@
               <w:pStyle w:val="normal1"/>
               <w:rPr>
                 <w:rFonts w:ascii="Arial" w:hAnsi="Arial" w:eastAsia="Arial" w:cs="Arial"/>
-                <w:sz w:val="18"/>
-                <w:szCs w:val="18"/>
-              </w:rPr>
-            </w:pPr>
-            <w:r>
-              <w:rPr>
-                <w:rFonts w:eastAsia="Arial" w:cs="Arial" w:ascii="Arial" w:hAnsi="Arial"/>
-                <w:sz w:val="18"/>
-                <w:szCs w:val="18"/>
+                <w:sz w:val="20"/>
+                <w:szCs w:val="20"/>
+              </w:rPr>
+            </w:pPr>
+            <w:r>
+              <w:rPr>
+                <w:rFonts w:eastAsia="Arial" w:cs="Arial" w:ascii="Arial" w:hAnsi="Arial"/>
+                <w:sz w:val="20"/>
+                <w:szCs w:val="20"/>
               </w:rPr>
             </w:r>
           </w:p>
@@ -2694,16 +2629,14 @@
             <w:pPr>
               <w:pStyle w:val="normal1"/>
               <w:rPr>
-                <w:rFonts w:ascii="Arial" w:hAnsi="Arial"/>
-                <w:sz w:val="18"/>
-                <w:szCs w:val="18"/>
-              </w:rPr>
-            </w:pPr>
-            <w:r>
-              <w:rPr>
-                <w:rFonts w:ascii="Arial" w:hAnsi="Arial"/>
-                <w:sz w:val="18"/>
-                <w:szCs w:val="18"/>
+                <w:sz w:val="20"/>
+                <w:szCs w:val="20"/>
+              </w:rPr>
+            </w:pPr>
+            <w:r>
+              <w:rPr>
+                <w:sz w:val="20"/>
+                <w:szCs w:val="20"/>
               </w:rPr>
               <w:drawing>
                 <wp:inline distT="0" distB="0" distL="0" distR="0">
@@ -2749,16 +2682,15 @@
             <w:pPr>
               <w:pStyle w:val="normal1"/>
               <w:rPr>
+                <w:sz w:val="20"/>
+                <w:szCs w:val="20"/>
+              </w:rPr>
+            </w:pPr>
+            <w:r>
+              <w:rPr>
                 <w:rFonts w:ascii="Arial" w:hAnsi="Arial"/>
-                <w:sz w:val="18"/>
-                <w:szCs w:val="18"/>
-              </w:rPr>
-            </w:pPr>
-            <w:r>
-              <w:rPr>
-                <w:rFonts w:ascii="Arial" w:hAnsi="Arial"/>
-                <w:sz w:val="18"/>
-                <w:szCs w:val="18"/>
+                <w:sz w:val="20"/>
+                <w:szCs w:val="20"/>
               </w:rPr>
               <w:t>Authorized Signatory</w:t>
             </w:r>
@@ -2860,7 +2792,7 @@
     <w:p>
       <w:pPr>
         <w:pStyle w:val="normal1"/>
-        <w:spacing w:lineRule="auto" w:line="93" w:before="4" w:after="0"/>
+        <w:spacing w:lineRule="auto" w:line="91" w:before="4" w:after="0"/>
         <w:rPr>
           <w:sz w:val="9"/>
           <w:szCs w:val="9"/>
@@ -2876,7 +2808,7 @@
     <w:p>
       <w:pPr>
         <w:pStyle w:val="normal1"/>
-        <w:spacing w:lineRule="auto" w:line="93" w:before="4" w:after="0"/>
+        <w:spacing w:lineRule="auto" w:line="91" w:before="4" w:after="0"/>
         <w:rPr>
           <w:sz w:val="9"/>
           <w:szCs w:val="9"/>

</xml_diff>